<commit_message>
This is a bucket
</commit_message>
<xml_diff>
--- a/SIpos Kristóf/eretségi gyakorlás/2026_Tavasz/padel.docx
+++ b/SIpos Kristóf/eretségi gyakorlás/2026_Tavasz/padel.docx
@@ -1,94 +1,112 @@
 
 <file path=word/document.xml><?xml version="1.0" encoding="utf-8"?>
-<w:document xmlns:wpc="http://schemas.microsoft.com/office/word/2010/wordprocessingCanvas" xmlns:mc="http://schemas.openxmlformats.org/markup-compatibility/2006" xmlns:o="urn:schemas-microsoft-com:office:office" xmlns:r="http://schemas.openxmlformats.org/officeDocument/2006/relationships" xmlns:m="http://schemas.openxmlformats.org/officeDocument/2006/math" xmlns:v="urn:schemas-microsoft-com:vml" xmlns:wp14="http://schemas.microsoft.com/office/word/2010/wordprocessingDrawing" xmlns:wp="http://schemas.openxmlformats.org/drawingml/2006/wordprocessingDrawing" xmlns:w10="urn:schemas-microsoft-com:office:word" xmlns:w="http://schemas.openxmlformats.org/wordprocessingml/2006/main" xmlns:w14="http://schemas.microsoft.com/office/word/2010/wordml" xmlns:w15="http://schemas.microsoft.com/office/word/2012/wordml" xmlns:wpg="http://schemas.microsoft.com/office/word/2010/wordprocessingGroup" xmlns:wpi="http://schemas.microsoft.com/office/word/2010/wordprocessingInk" xmlns:wne="http://schemas.microsoft.com/office/word/2006/wordml" xmlns:wps="http://schemas.microsoft.com/office/word/2010/wordprocessingShape" xmlns:w16se="http://schemas.microsoft.com/office/word/2015/wordml/symex" xmlns:w16cid="http://schemas.microsoft.com/office/word/2016/wordml/cid" xmlns:w16="http://schemas.microsoft.com/office/word/2018/wordml" xmlns:w16cex="http://schemas.microsoft.com/office/word/2018/wordml/cex" xmlns:w16sdtdh="http://schemas.microsoft.com/office/word/2020/wordml/sdtdatahash" xmlns:w16sdtfl="http://schemas.microsoft.com/office/word/2024/wordml/sdtformatlock" xmlns:a="http://schemas.openxmlformats.org/drawingml/2006/main" xmlns:pic="http://schemas.openxmlformats.org/drawingml/2006/picture" xmlns:a14="http://schemas.microsoft.com/office/drawing/2010/main" mc:Ignorable="w14 w15 wp14 w16se w16cid w16 w16cex w16sdtdh w16sdtfl">
+<w:document xmlns:wpc="http://schemas.microsoft.com/office/word/2010/wordprocessingCanvas" xmlns:cx="http://schemas.microsoft.com/office/drawing/2014/chartex" xmlns:cx1="http://schemas.microsoft.com/office/drawing/2015/9/8/chartex" xmlns:cx2="http://schemas.microsoft.com/office/drawing/2015/10/21/chartex" xmlns:cx3="http://schemas.microsoft.com/office/drawing/2016/5/9/chartex" xmlns:cx4="http://schemas.microsoft.com/office/drawing/2016/5/10/chartex" xmlns:cx5="http://schemas.microsoft.com/office/drawing/2016/5/11/chartex" xmlns:cx6="http://schemas.microsoft.com/office/drawing/2016/5/12/chartex" xmlns:cx7="http://schemas.microsoft.com/office/drawing/2016/5/13/chartex" xmlns:cx8="http://schemas.microsoft.com/office/drawing/2016/5/14/chartex" xmlns:mc="http://schemas.openxmlformats.org/markup-compatibility/2006" xmlns:aink="http://schemas.microsoft.com/office/drawing/2016/ink" xmlns:am3d="http://schemas.microsoft.com/office/drawing/2017/model3d" xmlns:o="urn:schemas-microsoft-com:office:office" xmlns:r="http://schemas.openxmlformats.org/officeDocument/2006/relationships" xmlns:m="http://schemas.openxmlformats.org/officeDocument/2006/math" xmlns:v="urn:schemas-microsoft-com:vml" xmlns:wp14="http://schemas.microsoft.com/office/word/2010/wordprocessingDrawing" xmlns:wp="http://schemas.openxmlformats.org/drawingml/2006/wordprocessingDrawing" xmlns:w10="urn:schemas-microsoft-com:office:word" xmlns:w="http://schemas.openxmlformats.org/wordprocessingml/2006/main" xmlns:w14="http://schemas.microsoft.com/office/word/2010/wordml" xmlns:w15="http://schemas.microsoft.com/office/word/2012/wordml" xmlns:w16cex="http://schemas.microsoft.com/office/word/2018/wordml/cex" xmlns:w16cid="http://schemas.microsoft.com/office/word/2016/wordml/cid" xmlns:w16="http://schemas.microsoft.com/office/word/2018/wordml" xmlns:w16sdtdh="http://schemas.microsoft.com/office/word/2020/wordml/sdtdatahash" xmlns:w16se="http://schemas.microsoft.com/office/word/2015/wordml/symex" xmlns:wpg="http://schemas.microsoft.com/office/word/2010/wordprocessingGroup" xmlns:wpi="http://schemas.microsoft.com/office/word/2010/wordprocessingInk" xmlns:wne="http://schemas.microsoft.com/office/word/2006/wordml" xmlns:wps="http://schemas.microsoft.com/office/word/2010/wordprocessingShape" mc:Ignorable="w14 w15 w16se w16cid w16 w16cex w16sdtdh wp14">
   <w:body>
-    <w:p xmlns:wp14="http://schemas.microsoft.com/office/word/2010/wordml" wp14:paraId="717E0096" wp14:textId="4F89C934">
-      <w:pPr>
-        <w:spacing w:before="120" w:beforeAutospacing="off" w:after="240" w:afterAutospacing="off" w:line="240" w:lineRule="auto"/>
-        <w:jc w:val="left"/>
-        <w:rPr>
-          <w:rFonts w:ascii="EB Garamond" w:hAnsi="EB Garamond" w:eastAsia="EB Garamond" w:cs="EB Garamond"/>
-          <w:b w:val="1"/>
-          <w:bCs w:val="1"/>
-        </w:rPr>
-      </w:pPr>
-      <w:r>
-        <w:rPr>
-          <w:rFonts w:ascii="EB Garamond" w:hAnsi="EB Garamond" w:eastAsia="EB Garamond" w:cs="EB Garamond"/>
-          <w:b w:val="1"/>
-          <w:bCs w:val="1"/>
+    <w:p>
+      <w:pPr>
+        <w:spacing w:before="120" w:after="240" w:line="240" w:lineRule="auto"/>
+        <w:rPr>
+          <w:rFonts w:ascii="EB Garamond" w:eastAsia="EB Garamond" w:hAnsi="EB Garamond" w:cs="EB Garamond"/>
+          <w:b/>
+          <w:bCs/>
+        </w:rPr>
+      </w:pPr>
+      <w:r>
+        <w:rPr>
+          <w:rFonts w:ascii="EB Garamond" w:eastAsia="EB Garamond" w:hAnsi="EB Garamond" w:cs="EB Garamond"/>
+          <w:b/>
+          <w:bCs/>
           <w:sz w:val="32"/>
           <w:szCs w:val="32"/>
         </w:rPr>
         <w:t>Padel: Az ütősport, ami meghódítja a világot</w:t>
       </w:r>
     </w:p>
-    <w:p xmlns:wp14="http://schemas.microsoft.com/office/word/2010/wordml" wp14:paraId="08EB59F7" wp14:textId="3E58F1AC">
-      <w:pPr>
-        <w:pStyle w:val="Normal"/>
-        <w:spacing w:after="120" w:afterAutospacing="off" w:line="240" w:lineRule="auto"/>
+    <w:p>
+      <w:pPr>
+        <w:spacing w:after="120" w:line="240" w:lineRule="auto"/>
         <w:jc w:val="both"/>
         <w:rPr>
-          <w:rFonts w:ascii="EB Garamond" w:hAnsi="EB Garamond" w:eastAsia="EB Garamond" w:cs="EB Garamond"/>
-        </w:rPr>
-      </w:pPr>
-      <w:r>
-        <w:rPr>
-          <w:rFonts w:ascii="EB Garamond" w:hAnsi="EB Garamond" w:eastAsia="EB Garamond" w:cs="EB Garamond"/>
+          <w:rFonts w:ascii="EB Garamond" w:eastAsia="EB Garamond" w:hAnsi="EB Garamond" w:cs="EB Garamond"/>
+        </w:rPr>
+      </w:pPr>
+      <w:r>
+        <w:rPr>
+          <w:rFonts w:ascii="EB Garamond" w:eastAsia="EB Garamond" w:hAnsi="EB Garamond" w:cs="EB Garamond"/>
         </w:rPr>
         <w:t>A padel egy gyors tempójú, izgalmas ütősport, amely a tenisz, a fallabda és a tollaslabda elemeit ötvözi. Népszerűsége az elmúlt években robbanásszerűen megnőtt, és világszerte egyre többen fedezik fel ennek a dinamikus játéknak az örömeit. Ebben a dokumentumban bemutatjuk a padel történetét, eszközeit és alapvető szabályait.</w:t>
       </w:r>
     </w:p>
-    <w:p xmlns:wp14="http://schemas.microsoft.com/office/word/2010/wordml" wp14:paraId="250C76F8" wp14:textId="708EF09D">
-      <w:pPr>
-        <w:pStyle w:val="Subtitle"/>
-        <w:rPr>
-          <w:rFonts w:ascii="EB Garamond" w:hAnsi="EB Garamond" w:eastAsia="EB Garamond" w:cs="EB Garamond"/>
-          <w:b w:val="1"/>
-          <w:bCs w:val="1"/>
-          <w:color w:val="auto"/>
-          <w:sz w:val="26"/>
-          <w:szCs w:val="26"/>
-        </w:rPr>
-      </w:pPr>
-      <w:r>
-        <w:rPr>
-          <w:b w:val="1"/>
-          <w:bCs w:val="1"/>
+    <w:p>
+      <w:pPr>
+        <w:pStyle w:val="Alcm"/>
+        <w:rPr>
+          <w:b/>
+          <w:bCs/>
+        </w:rPr>
+      </w:pPr>
+      <w:r>
+        <w:rPr>
+          <w:b/>
+          <w:bCs/>
         </w:rPr>
         <w:t>A padel története</w:t>
       </w:r>
     </w:p>
-    <w:p xmlns:wp14="http://schemas.microsoft.com/office/word/2010/wordml" wp14:paraId="76AD4B5B" wp14:textId="479805DE">
-      <w:pPr>
-        <w:pStyle w:val="Normal"/>
-        <w:spacing w:after="120" w:afterAutospacing="off" w:line="240" w:lineRule="auto"/>
+    <w:p>
+      <w:pPr>
+        <w:spacing w:after="120" w:line="240" w:lineRule="auto"/>
         <w:jc w:val="both"/>
         <w:rPr>
-          <w:rFonts w:ascii="EB Garamond" w:hAnsi="EB Garamond" w:eastAsia="EB Garamond" w:cs="EB Garamond"/>
-        </w:rPr>
-      </w:pPr>
-      <w:r>
+          <w:rFonts w:ascii="EB Garamond" w:eastAsia="EB Garamond" w:hAnsi="EB Garamond" w:cs="EB Garamond"/>
+        </w:rPr>
+      </w:pPr>
+      <w:r>
+        <w:rPr>
+          <w:noProof/>
+        </w:rPr>
         <w:drawing>
-          <wp:inline xmlns:wp14="http://schemas.microsoft.com/office/word/2010/wordprocessingDrawing" wp14:editId="4FD1792E" wp14:anchorId="46C02B14">
-            <wp:extent cx="1800000" cy="1750760"/>
+          <wp:anchor distT="0" distB="0" distL="114300" distR="114300" simplePos="0" relativeHeight="251659264" behindDoc="1" locked="0" layoutInCell="1" allowOverlap="1" wp14:anchorId="46C02B14" wp14:editId="45DB8A71">
+            <wp:simplePos x="0" y="0"/>
+            <wp:positionH relativeFrom="margin">
+              <wp:align>left</wp:align>
+            </wp:positionH>
+            <wp:positionV relativeFrom="paragraph">
+              <wp:posOffset>191135</wp:posOffset>
+            </wp:positionV>
+            <wp:extent cx="1799590" cy="1750695"/>
             <wp:effectExtent l="190500" t="190500" r="181610" b="192405"/>
+            <wp:wrapTight wrapText="bothSides">
+              <wp:wrapPolygon edited="0">
+                <wp:start x="457" y="-2350"/>
+                <wp:lineTo x="-2287" y="-1880"/>
+                <wp:lineTo x="-2287" y="20918"/>
+                <wp:lineTo x="457" y="23739"/>
+                <wp:lineTo x="20807" y="23739"/>
+                <wp:lineTo x="21036" y="23269"/>
+                <wp:lineTo x="23551" y="20918"/>
+                <wp:lineTo x="23551" y="1880"/>
+                <wp:lineTo x="21036" y="-1645"/>
+                <wp:lineTo x="20807" y="-2350"/>
+                <wp:lineTo x="457" y="-2350"/>
+              </wp:wrapPolygon>
+            </wp:wrapTight>
             <wp:docPr id="2128114578" name="drawing"/>
             <wp:cNvGraphicFramePr>
-              <a:graphicFrameLocks noChangeAspect="1"/>
+              <a:graphicFrameLocks xmlns:a="http://schemas.openxmlformats.org/drawingml/2006/main" noChangeAspect="1"/>
             </wp:cNvGraphicFramePr>
-            <a:graphic>
-              <a:graphicData xmlns:a="http://schemas.openxmlformats.org/drawingml/2006/main" uri="http://schemas.openxmlformats.org/drawingml/2006/picture">
+            <a:graphic xmlns:a="http://schemas.openxmlformats.org/drawingml/2006/main">
+              <a:graphicData uri="http://schemas.openxmlformats.org/drawingml/2006/picture">
                 <pic:pic xmlns:pic="http://schemas.openxmlformats.org/drawingml/2006/picture">
                   <pic:nvPicPr>
                     <pic:cNvPr id="453736539" name="Picture 453736539"/>
                     <pic:cNvPicPr/>
                   </pic:nvPicPr>
                   <pic:blipFill>
-                    <a:blip xmlns:r="http://schemas.openxmlformats.org/officeDocument/2006/relationships" r:embed="rId414275432">
+                    <a:blip r:embed="rId8">
                       <a:extLst>
                         <a:ext uri="{28A0092B-C50C-407E-A947-70E740481C1C}">
-                          <a14:useLocalDpi xmlns:a14="http://schemas.microsoft.com/office/drawing/2010/main"/>
+                          <a14:useLocalDpi xmlns:a14="http://schemas.microsoft.com/office/drawing/2010/main" val="0"/>
                         </a:ext>
                       </a:extLst>
                     </a:blip>
@@ -119,337 +137,176 @@
                 </pic:pic>
               </a:graphicData>
             </a:graphic>
-          </wp:inline>
+          </wp:anchor>
         </w:drawing>
       </w:r>
       <w:r>
         <w:rPr>
-          <w:rFonts w:ascii="EB Garamond" w:hAnsi="EB Garamond" w:eastAsia="EB Garamond" w:cs="EB Garamond"/>
-        </w:rPr>
-        <w:t xml:space="preserve">A </w:t>
-      </w:r>
-      <w:r>
-        <w:rPr>
-          <w:rFonts w:ascii="EB Garamond" w:hAnsi="EB Garamond" w:eastAsia="EB Garamond" w:cs="EB Garamond"/>
-        </w:rPr>
-        <w:t>padel</w:t>
-      </w:r>
-      <w:r>
-        <w:rPr>
-          <w:rFonts w:ascii="EB Garamond" w:hAnsi="EB Garamond" w:eastAsia="EB Garamond" w:cs="EB Garamond"/>
-        </w:rPr>
-        <w:t xml:space="preserve"> története egészen 1969-ig nyúlik vissza, amikor </w:t>
-      </w:r>
-      <w:r>
-        <w:rPr>
-          <w:rFonts w:ascii="EB Garamond" w:hAnsi="EB Garamond" w:eastAsia="EB Garamond" w:cs="EB Garamond"/>
-          <w:b w:val="1"/>
-          <w:bCs w:val="1"/>
-        </w:rPr>
-        <w:t>Enrique</w:t>
-      </w:r>
-      <w:r>
-        <w:rPr>
-          <w:rFonts w:ascii="EB Garamond" w:hAnsi="EB Garamond" w:eastAsia="EB Garamond" w:cs="EB Garamond"/>
-          <w:b w:val="1"/>
-          <w:bCs w:val="1"/>
-        </w:rPr>
-        <w:t xml:space="preserve"> </w:t>
-      </w:r>
-      <w:r>
-        <w:rPr>
-          <w:rFonts w:ascii="EB Garamond" w:hAnsi="EB Garamond" w:eastAsia="EB Garamond" w:cs="EB Garamond"/>
-          <w:b w:val="1"/>
-          <w:bCs w:val="1"/>
-        </w:rPr>
-        <w:t>Corcuera</w:t>
-      </w:r>
-      <w:r>
-        <w:rPr>
-          <w:rFonts w:ascii="EB Garamond" w:hAnsi="EB Garamond" w:eastAsia="EB Garamond" w:cs="EB Garamond"/>
-          <w:b w:val="1"/>
-          <w:bCs w:val="1"/>
-        </w:rPr>
-        <w:t xml:space="preserve"> </w:t>
-      </w:r>
-      <w:r>
-        <w:rPr>
-          <w:rFonts w:ascii="EB Garamond" w:hAnsi="EB Garamond" w:eastAsia="EB Garamond" w:cs="EB Garamond"/>
-        </w:rPr>
-        <w:t xml:space="preserve">mexikói üzletember </w:t>
-      </w:r>
-      <w:r>
-        <w:rPr>
-          <w:rFonts w:ascii="EB Garamond" w:hAnsi="EB Garamond" w:eastAsia="EB Garamond" w:cs="EB Garamond"/>
-        </w:rPr>
-        <w:t>Acapulcóban</w:t>
-      </w:r>
-      <w:r>
-        <w:rPr>
-          <w:rFonts w:ascii="EB Garamond" w:hAnsi="EB Garamond" w:eastAsia="EB Garamond" w:cs="EB Garamond"/>
-        </w:rPr>
-        <w:t xml:space="preserve"> megépítette az első </w:t>
-      </w:r>
-      <w:r>
-        <w:rPr>
-          <w:rFonts w:ascii="EB Garamond" w:hAnsi="EB Garamond" w:eastAsia="EB Garamond" w:cs="EB Garamond"/>
-        </w:rPr>
-        <w:t>padelpályát</w:t>
-      </w:r>
-      <w:r>
-        <w:rPr>
-          <w:rFonts w:ascii="EB Garamond" w:hAnsi="EB Garamond" w:eastAsia="EB Garamond" w:cs="EB Garamond"/>
-        </w:rPr>
-        <w:t xml:space="preserve"> a háza udvarán. </w:t>
-      </w:r>
-      <w:r>
-        <w:rPr>
-          <w:rFonts w:ascii="EB Garamond" w:hAnsi="EB Garamond" w:eastAsia="EB Garamond" w:cs="EB Garamond"/>
-        </w:rPr>
-        <w:t>Corcuera</w:t>
-      </w:r>
-      <w:r>
-        <w:rPr>
-          <w:rFonts w:ascii="EB Garamond" w:hAnsi="EB Garamond" w:eastAsia="EB Garamond" w:cs="EB Garamond"/>
-        </w:rPr>
-        <w:t xml:space="preserve"> eredetileg squashpályát szeretett volna, de a rendelkezésre álló terület korlátozott volt. Ezért egy kisebb pályát alakított ki, amit fallabda-szerű falakkal vett körül, hogy a labda ne repüljön ki a szomszédos területekre. A labdákat fával ütötték. Ez a kezdetleges pálya adta az alapját a mai </w:t>
-      </w:r>
-      <w:r>
-        <w:rPr>
-          <w:rFonts w:ascii="EB Garamond" w:hAnsi="EB Garamond" w:eastAsia="EB Garamond" w:cs="EB Garamond"/>
-        </w:rPr>
-        <w:t>padelnek</w:t>
-      </w:r>
-      <w:r>
-        <w:rPr>
-          <w:rFonts w:ascii="EB Garamond" w:hAnsi="EB Garamond" w:eastAsia="EB Garamond" w:cs="EB Garamond"/>
-        </w:rPr>
-        <w:t>.</w:t>
-      </w:r>
-    </w:p>
-    <w:p xmlns:wp14="http://schemas.microsoft.com/office/word/2010/wordml" wp14:paraId="57148F68" wp14:textId="5A775802">
-      <w:pPr>
-        <w:pStyle w:val="Normal"/>
-        <w:spacing w:after="120" w:afterAutospacing="off" w:line="240" w:lineRule="auto"/>
+          <w:rFonts w:ascii="EB Garamond" w:eastAsia="EB Garamond" w:hAnsi="EB Garamond" w:cs="EB Garamond"/>
+        </w:rPr>
+        <w:t xml:space="preserve">A padel története egészen 1969-ig nyúlik vissza, amikor </w:t>
+      </w:r>
+      <w:r>
+        <w:rPr>
+          <w:rFonts w:ascii="EB Garamond" w:eastAsia="EB Garamond" w:hAnsi="EB Garamond" w:cs="EB Garamond"/>
+          <w:b/>
+          <w:bCs/>
+        </w:rPr>
+        <w:t xml:space="preserve">Enrique Corcuera </w:t>
+      </w:r>
+      <w:r>
+        <w:rPr>
+          <w:rFonts w:ascii="EB Garamond" w:eastAsia="EB Garamond" w:hAnsi="EB Garamond" w:cs="EB Garamond"/>
+        </w:rPr>
+        <w:t>mexikói üzletember Acapulcóban megépítette az első padelpályát a háza udvarán. Corcuera eredetileg squashpályát szeretett volna, de a rendelkezésre álló terület korlátozott volt. Ezért egy kisebb pályát alakított ki, amit fallabda-szerű falakkal vett körül, hogy a labda ne repüljön ki a szomszédos területekre. A labdákat fával ütötték. Ez a kezdetleges pálya adta az alapját a mai padelnek.</w:t>
+      </w:r>
+    </w:p>
+    <w:p>
+      <w:pPr>
+        <w:spacing w:after="120" w:line="240" w:lineRule="auto"/>
         <w:jc w:val="both"/>
         <w:rPr>
-          <w:rFonts w:ascii="EB Garamond" w:hAnsi="EB Garamond" w:eastAsia="EB Garamond" w:cs="EB Garamond"/>
-        </w:rPr>
-      </w:pPr>
-      <w:r>
-        <w:rPr>
-          <w:rFonts w:ascii="EB Garamond" w:hAnsi="EB Garamond" w:eastAsia="EB Garamond" w:cs="EB Garamond"/>
-        </w:rPr>
-        <w:t xml:space="preserve">A sport hamar népszerűvé vált Mexikóban, majd Spanyolországba is eljutott, köszönhetően </w:t>
-      </w:r>
-      <w:r>
-        <w:rPr>
-          <w:rFonts w:ascii="EB Garamond" w:hAnsi="EB Garamond" w:eastAsia="EB Garamond" w:cs="EB Garamond"/>
-        </w:rPr>
-        <w:t>Corcuera</w:t>
-      </w:r>
-      <w:r>
-        <w:rPr>
-          <w:rFonts w:ascii="EB Garamond" w:hAnsi="EB Garamond" w:eastAsia="EB Garamond" w:cs="EB Garamond"/>
-        </w:rPr>
-        <w:t xml:space="preserve"> barátjának, Alfonso de </w:t>
-      </w:r>
-      <w:r>
-        <w:rPr>
-          <w:rFonts w:ascii="EB Garamond" w:hAnsi="EB Garamond" w:eastAsia="EB Garamond" w:cs="EB Garamond"/>
-        </w:rPr>
-        <w:t>Hohenlohe</w:t>
-      </w:r>
-      <w:r>
-        <w:rPr>
-          <w:rFonts w:ascii="EB Garamond" w:hAnsi="EB Garamond" w:eastAsia="EB Garamond" w:cs="EB Garamond"/>
-        </w:rPr>
-        <w:t xml:space="preserve"> hercegnek, aki az 1970-es években Spanyolországban építette fel az első európai </w:t>
-      </w:r>
-      <w:r>
-        <w:rPr>
-          <w:rFonts w:ascii="EB Garamond" w:hAnsi="EB Garamond" w:eastAsia="EB Garamond" w:cs="EB Garamond"/>
-        </w:rPr>
-        <w:t>padelpályákat</w:t>
-      </w:r>
-      <w:r>
-        <w:rPr>
-          <w:rFonts w:ascii="EB Garamond" w:hAnsi="EB Garamond" w:eastAsia="EB Garamond" w:cs="EB Garamond"/>
-        </w:rPr>
-        <w:t xml:space="preserve"> </w:t>
-      </w:r>
-      <w:r>
-        <w:rPr>
-          <w:rFonts w:ascii="EB Garamond" w:hAnsi="EB Garamond" w:eastAsia="EB Garamond" w:cs="EB Garamond"/>
-        </w:rPr>
-        <w:t>Marbellában</w:t>
-      </w:r>
-      <w:r>
-        <w:rPr>
-          <w:rFonts w:ascii="EB Garamond" w:hAnsi="EB Garamond" w:eastAsia="EB Garamond" w:cs="EB Garamond"/>
-        </w:rPr>
-        <w:t>. A játék azóta Dél-Amerikában (különösen Argentínában), Spanyolországban, majd fokozatosan egész Európában és a világ más részein is elterjedt.</w:t>
-      </w:r>
-    </w:p>
-    <w:p xmlns:wp14="http://schemas.microsoft.com/office/word/2010/wordml" wp14:paraId="46E8EC73" wp14:textId="4F289CDE">
-      <w:pPr>
-        <w:pStyle w:val="Normal"/>
-        <w:spacing w:before="120" w:beforeAutospacing="off" w:after="120" w:afterAutospacing="off" w:line="240" w:lineRule="auto"/>
+          <w:rFonts w:ascii="EB Garamond" w:eastAsia="EB Garamond" w:hAnsi="EB Garamond" w:cs="EB Garamond"/>
+        </w:rPr>
+      </w:pPr>
+      <w:r>
+        <w:rPr>
+          <w:rFonts w:ascii="EB Garamond" w:eastAsia="EB Garamond" w:hAnsi="EB Garamond" w:cs="EB Garamond"/>
+        </w:rPr>
+        <w:t>A sport hamar népszerűvé vált Mexikóban, majd Spanyolországba is eljutott, köszönhetően Corcuera barátjának, Alfonso de Hohenlohe hercegnek, aki az 1970-es években Spanyolországban építette fel az első európai padelpályákat Marbellában. A játék azóta Dél-Amerikában (különösen Argentínában), Spanyolországban, majd fokozatosan egész Európában és a világ más részein is elterjedt.</w:t>
+      </w:r>
+    </w:p>
+    <w:p>
+      <w:pPr>
+        <w:spacing w:before="120" w:after="120" w:line="240" w:lineRule="auto"/>
         <w:jc w:val="both"/>
         <w:rPr>
-          <w:rFonts w:ascii="EB Garamond" w:hAnsi="EB Garamond" w:eastAsia="EB Garamond" w:cs="EB Garamond"/>
-        </w:rPr>
-      </w:pPr>
-      <w:r>
-        <w:rPr>
-          <w:rStyle w:val="SubtitleChar"/>
-          <w:b w:val="1"/>
-          <w:bCs w:val="1"/>
+          <w:rFonts w:ascii="EB Garamond" w:eastAsia="EB Garamond" w:hAnsi="EB Garamond" w:cs="EB Garamond"/>
+        </w:rPr>
+      </w:pPr>
+      <w:r>
+        <w:rPr>
+          <w:rStyle w:val="AlcmChar"/>
+          <w:b/>
+          <w:bCs/>
         </w:rPr>
         <w:t>A</w:t>
       </w:r>
       <w:r>
         <w:rPr>
-          <w:rFonts w:ascii="EB Garamond" w:hAnsi="EB Garamond" w:eastAsia="EB Garamond" w:cs="EB Garamond"/>
-          <w:b w:val="1"/>
-          <w:bCs w:val="1"/>
-          <w:color w:val="auto"/>
+          <w:rFonts w:ascii="EB Garamond" w:eastAsia="EB Garamond" w:hAnsi="EB Garamond" w:cs="EB Garamond"/>
+          <w:b/>
+          <w:bCs/>
           <w:sz w:val="26"/>
           <w:szCs w:val="26"/>
-          <w:lang w:eastAsia="en-US" w:bidi="ar-SA"/>
         </w:rPr>
         <w:t xml:space="preserve"> padel eszközei</w:t>
       </w:r>
     </w:p>
-    <w:p xmlns:wp14="http://schemas.microsoft.com/office/word/2010/wordml" wp14:paraId="68717917" wp14:textId="414AADA3">
-      <w:pPr>
-        <w:pStyle w:val="Normal"/>
-        <w:spacing w:after="120" w:afterAutospacing="off" w:line="240" w:lineRule="auto"/>
+    <w:p>
+      <w:pPr>
+        <w:spacing w:after="120" w:line="240" w:lineRule="auto"/>
         <w:jc w:val="both"/>
         <w:rPr>
-          <w:rFonts w:ascii="EB Garamond" w:hAnsi="EB Garamond" w:eastAsia="EB Garamond" w:cs="EB Garamond"/>
-        </w:rPr>
-      </w:pPr>
-      <w:r>
-        <w:rPr>
-          <w:rFonts w:ascii="EB Garamond" w:hAnsi="EB Garamond" w:eastAsia="EB Garamond" w:cs="EB Garamond"/>
-        </w:rPr>
-        <w:t xml:space="preserve">A </w:t>
-      </w:r>
-      <w:r>
-        <w:rPr>
-          <w:rFonts w:ascii="EB Garamond" w:hAnsi="EB Garamond" w:eastAsia="EB Garamond" w:cs="EB Garamond"/>
-        </w:rPr>
-        <w:t>padelhez</w:t>
-      </w:r>
-      <w:r>
-        <w:rPr>
-          <w:rFonts w:ascii="EB Garamond" w:hAnsi="EB Garamond" w:eastAsia="EB Garamond" w:cs="EB Garamond"/>
-        </w:rPr>
-        <w:t xml:space="preserve"> viszonylag kevés speciális felszerelésre van szükség, ami hozzájárul a sport könnyű elérhetőségéhez.</w:t>
-      </w:r>
-    </w:p>
-    <w:p xmlns:wp14="http://schemas.microsoft.com/office/word/2010/wordml" wp14:paraId="32CD515B" wp14:textId="524F5B72">
-      <w:pPr>
-        <w:pStyle w:val="Normal"/>
-        <w:spacing w:before="120" w:beforeAutospacing="off" w:after="120" w:afterAutospacing="off" w:line="240" w:lineRule="auto"/>
+          <w:rFonts w:ascii="EB Garamond" w:eastAsia="EB Garamond" w:hAnsi="EB Garamond" w:cs="EB Garamond"/>
+        </w:rPr>
+      </w:pPr>
+      <w:r>
+        <w:rPr>
+          <w:rFonts w:ascii="EB Garamond" w:eastAsia="EB Garamond" w:hAnsi="EB Garamond" w:cs="EB Garamond"/>
+        </w:rPr>
+        <w:t>A padelhez viszonylag kevés speciális felszerelésre van szükség, ami hozzájárul a sport könnyű elérhetőségéhez.</w:t>
+      </w:r>
+    </w:p>
+    <w:p>
+      <w:pPr>
+        <w:spacing w:before="120" w:after="120" w:line="240" w:lineRule="auto"/>
         <w:jc w:val="both"/>
         <w:rPr>
-          <w:rFonts w:ascii="EB Garamond" w:hAnsi="EB Garamond" w:eastAsia="EB Garamond" w:cs="EB Garamond"/>
-          <w:b w:val="1"/>
-          <w:bCs w:val="1"/>
-        </w:rPr>
-      </w:pPr>
-      <w:r>
-        <w:rPr>
-          <w:rStyle w:val="SubtitleChar"/>
-          <w:b w:val="1"/>
-          <w:bCs w:val="1"/>
+          <w:rFonts w:ascii="EB Garamond" w:eastAsia="EB Garamond" w:hAnsi="EB Garamond" w:cs="EB Garamond"/>
+          <w:b/>
+          <w:bCs/>
+        </w:rPr>
+      </w:pPr>
+      <w:r>
+        <w:rPr>
+          <w:rStyle w:val="AlcmChar"/>
+          <w:b/>
+          <w:bCs/>
         </w:rPr>
         <w:t>Padelütő</w:t>
       </w:r>
     </w:p>
-    <w:p xmlns:wp14="http://schemas.microsoft.com/office/word/2010/wordml" wp14:paraId="4854F13A" wp14:textId="77714803">
-      <w:pPr>
-        <w:pStyle w:val="Normal"/>
-        <w:spacing w:after="120" w:afterAutospacing="off" w:line="240" w:lineRule="auto"/>
+    <w:p>
+      <w:pPr>
+        <w:spacing w:after="120" w:line="240" w:lineRule="auto"/>
         <w:jc w:val="both"/>
         <w:rPr>
-          <w:rFonts w:ascii="EB Garamond" w:hAnsi="EB Garamond" w:eastAsia="EB Garamond" w:cs="EB Garamond"/>
-        </w:rPr>
-      </w:pPr>
-      <w:r>
-        <w:rPr>
-          <w:rFonts w:ascii="EB Garamond" w:hAnsi="EB Garamond" w:eastAsia="EB Garamond" w:cs="EB Garamond"/>
+          <w:rFonts w:ascii="EB Garamond" w:eastAsia="EB Garamond" w:hAnsi="EB Garamond" w:cs="EB Garamond"/>
+        </w:rPr>
+      </w:pPr>
+      <w:r>
+        <w:rPr>
+          <w:rFonts w:ascii="EB Garamond" w:eastAsia="EB Garamond" w:hAnsi="EB Garamond" w:cs="EB Garamond"/>
         </w:rPr>
         <w:t>A padelütő (vagy „pala”) különbözik a tenisz- vagy squashütőktől. Tömör anyagból készül, általában üvegszálból, karbonból vagy ezek kombinációjából. Az ütőfej felülete perforált, ami csökkenti a légellenállást és segít a labda kontrollálásában. Nincsenek húrok rajta, mint a teniszütőn. Az ütő súlya és formája változhat, de alapvetően lapos felülettel rendelkezik.</w:t>
       </w:r>
     </w:p>
-    <w:p xmlns:wp14="http://schemas.microsoft.com/office/word/2010/wordml" wp14:paraId="1D007B14" wp14:textId="4AB31076">
-      <w:pPr>
-        <w:pStyle w:val="Normal"/>
-        <w:spacing w:before="120" w:beforeAutospacing="off" w:after="120" w:afterAutospacing="off" w:line="240" w:lineRule="auto"/>
+    <w:p>
+      <w:pPr>
+        <w:spacing w:before="120" w:after="120" w:line="240" w:lineRule="auto"/>
         <w:jc w:val="both"/>
         <w:rPr>
-          <w:rFonts w:ascii="EB Garamond" w:hAnsi="EB Garamond" w:eastAsia="EB Garamond" w:cs="EB Garamond"/>
-          <w:b w:val="1"/>
-          <w:bCs w:val="1"/>
-        </w:rPr>
-      </w:pPr>
-      <w:r>
-        <w:rPr>
-          <w:rStyle w:val="SubtitleChar"/>
-          <w:b w:val="1"/>
-          <w:bCs w:val="1"/>
+          <w:rFonts w:ascii="EB Garamond" w:eastAsia="EB Garamond" w:hAnsi="EB Garamond" w:cs="EB Garamond"/>
+          <w:b/>
+          <w:bCs/>
+        </w:rPr>
+      </w:pPr>
+      <w:r>
+        <w:rPr>
+          <w:rStyle w:val="AlcmChar"/>
+          <w:b/>
+          <w:bCs/>
         </w:rPr>
         <w:t>Padellabda</w:t>
       </w:r>
     </w:p>
-    <w:p xmlns:wp14="http://schemas.microsoft.com/office/word/2010/wordml" wp14:paraId="3C7C76BA" wp14:textId="2FE91E30">
-      <w:pPr>
-        <w:pStyle w:val="Normal"/>
-        <w:spacing w:after="120" w:afterAutospacing="off" w:line="240" w:lineRule="auto"/>
-        <w:jc w:val="both"/>
-        <w:rPr>
-          <w:rFonts w:ascii="EB Garamond" w:hAnsi="EB Garamond" w:eastAsia="EB Garamond" w:cs="EB Garamond"/>
-        </w:rPr>
-      </w:pPr>
-      <w:r>
-        <w:rPr>
-          <w:rFonts w:ascii="EB Garamond" w:hAnsi="EB Garamond" w:eastAsia="EB Garamond" w:cs="EB Garamond"/>
-        </w:rPr>
-        <w:t xml:space="preserve">A </w:t>
-      </w:r>
-      <w:r>
-        <w:rPr>
-          <w:rFonts w:ascii="EB Garamond" w:hAnsi="EB Garamond" w:eastAsia="EB Garamond" w:cs="EB Garamond"/>
-        </w:rPr>
-        <w:t>padellabda</w:t>
-      </w:r>
-      <w:r>
-        <w:rPr>
-          <w:rFonts w:ascii="EB Garamond" w:hAnsi="EB Garamond" w:eastAsia="EB Garamond" w:cs="EB Garamond"/>
-        </w:rPr>
-        <w:t xml:space="preserve"> méretét és nyomását tekintve nagyon hasonlít a teniszlabdához, de általában kissé alacsonyabb nyomású. Ezáltal a labda lassabban pattan és könnyebben irányítható, ami hozzájárul a játék dinamikájához.</w:t>
-      </w:r>
-      <w:r>
+    <w:p>
+      <w:pPr>
+        <w:spacing w:after="120" w:line="240" w:lineRule="auto"/>
+        <w:jc w:val="center"/>
+        <w:rPr>
+          <w:rFonts w:ascii="EB Garamond" w:eastAsia="EB Garamond" w:hAnsi="EB Garamond" w:cs="EB Garamond"/>
+        </w:rPr>
+      </w:pPr>
+      <w:r>
+        <w:rPr>
+          <w:rFonts w:ascii="EB Garamond" w:eastAsia="EB Garamond" w:hAnsi="EB Garamond" w:cs="EB Garamond"/>
+        </w:rPr>
+        <w:lastRenderedPageBreak/>
+        <w:t>A padellabda méretét és nyomását tekintve nagyon hasonlít a teniszlabdához, de általában kissé alacsonyabb nyomású. Ezáltal a labda lassabban pattan és könnyebben irányítható, ami hozzájárul a játék dinamikájához.</w:t>
+      </w:r>
+      <w:r>
+        <w:rPr>
+          <w:noProof/>
+        </w:rPr>
         <w:drawing>
-          <wp:inline xmlns:wp14="http://schemas.microsoft.com/office/word/2010/wordprocessingDrawing" wp14:editId="1B5340BE" wp14:anchorId="1CC55546">
+          <wp:inline distT="0" distB="0" distL="0" distR="0" wp14:anchorId="1CC55546" wp14:editId="1B5340BE">
             <wp:extent cx="2160000" cy="1540870"/>
             <wp:effectExtent l="190500" t="190500" r="183515" b="193040"/>
             <wp:docPr id="1888486778" name="drawing"/>
             <wp:cNvGraphicFramePr>
-              <a:graphicFrameLocks noChangeAspect="1"/>
+              <a:graphicFrameLocks xmlns:a="http://schemas.openxmlformats.org/drawingml/2006/main" noChangeAspect="1"/>
             </wp:cNvGraphicFramePr>
-            <a:graphic>
-              <a:graphicData xmlns:a="http://schemas.openxmlformats.org/drawingml/2006/main" uri="http://schemas.openxmlformats.org/drawingml/2006/picture">
+            <a:graphic xmlns:a="http://schemas.openxmlformats.org/drawingml/2006/main">
+              <a:graphicData uri="http://schemas.openxmlformats.org/drawingml/2006/picture">
                 <pic:pic xmlns:pic="http://schemas.openxmlformats.org/drawingml/2006/picture">
                   <pic:nvPicPr>
                     <pic:cNvPr id="1888486778" name="Picture 1888486778"/>
                     <pic:cNvPicPr/>
                   </pic:nvPicPr>
                   <pic:blipFill>
-                    <a:blip xmlns:r="http://schemas.openxmlformats.org/officeDocument/2006/relationships" r:embed="rId2091027313">
+                    <a:blip r:embed="rId9">
                       <a:extLst>
                         <a:ext uri="{28A0092B-C50C-407E-A947-70E740481C1C}">
                           <a14:useLocalDpi xmlns:a14="http://schemas.microsoft.com/office/drawing/2010/main"/>
@@ -487,32 +344,33 @@
         </w:drawing>
       </w:r>
     </w:p>
-    <w:p xmlns:wp14="http://schemas.microsoft.com/office/word/2010/wordml" wp14:paraId="2F532296" wp14:textId="6DB8B9C0">
-      <w:pPr>
-        <w:pStyle w:val="Subtitle"/>
-        <w:rPr>
-          <w:rFonts w:ascii="EB Garamond" w:hAnsi="EB Garamond" w:eastAsia="EB Garamond" w:cs="EB Garamond"/>
-          <w:b w:val="1"/>
-          <w:bCs w:val="1"/>
-        </w:rPr>
-      </w:pPr>
-      <w:r>
-        <w:rPr>
-          <w:b w:val="1"/>
-          <w:bCs w:val="1"/>
+    <w:p>
+      <w:pPr>
+        <w:pStyle w:val="Alcm"/>
+        <w:rPr>
+          <w:b/>
+          <w:bCs/>
+        </w:rPr>
+      </w:pPr>
+      <w:r>
+        <w:rPr>
+          <w:b/>
+          <w:bCs/>
         </w:rPr>
         <w:t>Padelpálya</w:t>
       </w:r>
     </w:p>
-    <w:p xmlns:wp14="http://schemas.microsoft.com/office/word/2010/wordml" wp14:paraId="2AA35E38" wp14:textId="2EC2B436">
-      <w:pPr>
-        <w:pStyle w:val="Normal"/>
-        <w:spacing w:after="120" w:afterAutospacing="off" w:line="240" w:lineRule="auto"/>
+    <w:p>
+      <w:pPr>
+        <w:spacing w:after="120" w:line="240" w:lineRule="auto"/>
         <w:jc w:val="both"/>
       </w:pPr>
       <w:r>
+        <w:rPr>
+          <w:noProof/>
+        </w:rPr>
         <w:drawing>
-          <wp:anchor xmlns:wp14="http://schemas.microsoft.com/office/word/2010/wordprocessingDrawing" distT="0" distB="0" distL="114300" distR="114300" simplePos="0" relativeHeight="251658240" behindDoc="0" locked="0" layoutInCell="1" allowOverlap="1" wp14:editId="3D5A7036" wp14:anchorId="78BAAB90">
+          <wp:anchor distT="0" distB="0" distL="114300" distR="114300" simplePos="0" relativeHeight="251658240" behindDoc="0" locked="0" layoutInCell="1" allowOverlap="1" wp14:anchorId="78BAAB90" wp14:editId="3D5A7036">
             <wp:simplePos x="0" y="0"/>
             <wp:positionH relativeFrom="column">
               <wp:align>right</wp:align>
@@ -525,17 +383,17 @@
             <wp:wrapSquare wrapText="bothSides"/>
             <wp:docPr id="945911723" name="drawing"/>
             <wp:cNvGraphicFramePr>
-              <a:graphicFrameLocks noChangeAspect="1"/>
+              <a:graphicFrameLocks xmlns:a="http://schemas.openxmlformats.org/drawingml/2006/main" noChangeAspect="1"/>
             </wp:cNvGraphicFramePr>
-            <a:graphic>
-              <a:graphicData xmlns:a="http://schemas.openxmlformats.org/drawingml/2006/main" uri="http://schemas.openxmlformats.org/drawingml/2006/picture">
+            <a:graphic xmlns:a="http://schemas.openxmlformats.org/drawingml/2006/main">
+              <a:graphicData uri="http://schemas.openxmlformats.org/drawingml/2006/picture">
                 <pic:pic xmlns:pic="http://schemas.openxmlformats.org/drawingml/2006/picture">
                   <pic:nvPicPr>
                     <pic:cNvPr id="257777432" name="Picture 257777432"/>
                     <pic:cNvPicPr/>
                   </pic:nvPicPr>
                   <pic:blipFill>
-                    <a:blip xmlns:r="http://schemas.openxmlformats.org/officeDocument/2006/relationships" r:embed="rId1134485434">
+                    <a:blip r:embed="rId10">
                       <a:extLst>
                         <a:ext uri="{28A0092B-C50C-407E-A947-70E740481C1C}">
                           <a14:useLocalDpi xmlns:a14="http://schemas.microsoft.com/office/drawing/2010/main"/>
@@ -547,7 +405,7 @@
                     </a:stretch>
                   </pic:blipFill>
                   <pic:spPr>
-                    <a:xfrm rot="0">
+                    <a:xfrm>
                       <a:off x="0" y="0"/>
                       <a:ext cx="2880000" cy="1618551"/>
                     </a:xfrm>
@@ -569,382 +427,488 @@
       </w:r>
       <w:r>
         <w:rPr>
-          <w:rFonts w:ascii="EB Garamond" w:hAnsi="EB Garamond" w:eastAsia="EB Garamond" w:cs="EB Garamond"/>
-        </w:rPr>
-        <w:t xml:space="preserve">A </w:t>
-      </w:r>
-      <w:r>
-        <w:rPr>
-          <w:rFonts w:ascii="EB Garamond" w:hAnsi="EB Garamond" w:eastAsia="EB Garamond" w:cs="EB Garamond"/>
-        </w:rPr>
-        <w:t>padelpálya</w:t>
-      </w:r>
-      <w:r>
-        <w:rPr>
-          <w:rFonts w:ascii="EB Garamond" w:hAnsi="EB Garamond" w:eastAsia="EB Garamond" w:cs="EB Garamond"/>
-        </w:rPr>
-        <w:t xml:space="preserve"> az egyik legkülönlegesebb eleme a sportnak. A pálya mérete 10 méter széles és 20 méter hosszú. Üveg- és/vagy drótháló falakkal van körülvéve, amelyek elválaszthatatlan részét képezik a játéknak, mivel a labda pattanhat róluk. A pálya közepén háló van, hasonlóan a teniszpályához. A felület anyaga általában </w:t>
-      </w:r>
-      <w:r>
-        <w:rPr>
-          <w:rFonts w:ascii="EB Garamond" w:hAnsi="EB Garamond" w:eastAsia="EB Garamond" w:cs="EB Garamond"/>
-        </w:rPr>
-        <w:t>műfű</w:t>
-      </w:r>
-      <w:r>
-        <w:rPr>
-          <w:rFonts w:ascii="EB Garamond" w:hAnsi="EB Garamond" w:eastAsia="EB Garamond" w:cs="EB Garamond"/>
-        </w:rPr>
-        <w:t xml:space="preserve"> vagy beton</w:t>
-      </w:r>
-      <w:r>
-        <w:rPr>
-          <w:rFonts w:ascii="EB Garamond" w:hAnsi="EB Garamond" w:eastAsia="EB Garamond" w:cs="EB Garamond"/>
-        </w:rPr>
-        <w:t>.</w:t>
-      </w:r>
-    </w:p>
-    <w:p xmlns:wp14="http://schemas.microsoft.com/office/word/2010/wordml" wp14:paraId="14822926" wp14:textId="53969F4D">
-      <w:pPr>
-        <w:pStyle w:val="Normal"/>
-        <w:spacing w:before="120" w:beforeAutospacing="off" w:after="120" w:afterAutospacing="off" w:line="240" w:lineRule="auto"/>
+          <w:rFonts w:ascii="EB Garamond" w:eastAsia="EB Garamond" w:hAnsi="EB Garamond" w:cs="EB Garamond"/>
+        </w:rPr>
+        <w:t>A padelpálya az egyik legkülönlegesebb eleme a sportnak. A pálya mérete 10 méter széles és 20 méter hosszú. Üveg- és/vagy drótháló falakkal van körülvéve, amelyek elválaszthatatlan részét képezik a játéknak, mivel a labda pattanhat róluk. A pálya közepén háló van, hasonlóan a teniszpályához. A felület anyaga általában műfű vagy beton.</w:t>
+      </w:r>
+    </w:p>
+    <w:p>
+      <w:pPr>
+        <w:spacing w:before="120" w:after="120" w:line="240" w:lineRule="auto"/>
         <w:jc w:val="both"/>
         <w:rPr>
-          <w:rFonts w:ascii="EB Garamond" w:hAnsi="EB Garamond" w:eastAsia="EB Garamond" w:cs="EB Garamond"/>
-        </w:rPr>
-      </w:pPr>
-      <w:r>
-        <w:rPr>
-          <w:rStyle w:val="SubtitleChar"/>
-          <w:b w:val="1"/>
-          <w:bCs w:val="1"/>
+          <w:rFonts w:ascii="EB Garamond" w:eastAsia="EB Garamond" w:hAnsi="EB Garamond" w:cs="EB Garamond"/>
+        </w:rPr>
+      </w:pPr>
+      <w:r>
+        <w:rPr>
+          <w:rStyle w:val="AlcmChar"/>
+          <w:b/>
+          <w:bCs/>
         </w:rPr>
         <w:t>A padel szabályai</w:t>
       </w:r>
     </w:p>
-    <w:p xmlns:wp14="http://schemas.microsoft.com/office/word/2010/wordml" wp14:paraId="2991C4D6" wp14:textId="2611EF9B">
-      <w:pPr>
-        <w:pStyle w:val="Normal"/>
-        <w:spacing w:after="120" w:afterAutospacing="off" w:line="240" w:lineRule="auto"/>
+    <w:p>
+      <w:pPr>
+        <w:spacing w:after="120" w:line="240" w:lineRule="auto"/>
         <w:jc w:val="both"/>
         <w:rPr>
-          <w:rFonts w:ascii="EB Garamond" w:hAnsi="EB Garamond" w:eastAsia="EB Garamond" w:cs="EB Garamond"/>
-        </w:rPr>
-      </w:pPr>
-      <w:r>
-        <w:rPr>
-          <w:rFonts w:ascii="EB Garamond" w:hAnsi="EB Garamond" w:eastAsia="EB Garamond" w:cs="EB Garamond"/>
+          <w:rFonts w:ascii="EB Garamond" w:eastAsia="EB Garamond" w:hAnsi="EB Garamond" w:cs="EB Garamond"/>
+        </w:rPr>
+      </w:pPr>
+      <w:r>
+        <w:rPr>
+          <w:rFonts w:ascii="EB Garamond" w:eastAsia="EB Garamond" w:hAnsi="EB Garamond" w:cs="EB Garamond"/>
         </w:rPr>
         <w:t>A padel szabályai viszonylag egyszerűek, ami megkönnyíti a kezdők számára a játék elsajátítását.</w:t>
       </w:r>
     </w:p>
-    <w:p xmlns:wp14="http://schemas.microsoft.com/office/word/2010/wordml" wp14:paraId="6B441269" wp14:textId="0935ECBC">
-      <w:pPr>
-        <w:pStyle w:val="Normal"/>
-        <w:spacing w:before="120" w:beforeAutospacing="off" w:after="120" w:afterAutospacing="off" w:line="240" w:lineRule="auto"/>
+    <w:p>
+      <w:pPr>
+        <w:spacing w:before="120" w:after="120" w:line="240" w:lineRule="auto"/>
         <w:jc w:val="both"/>
         <w:rPr>
-          <w:rFonts w:ascii="EB Garamond" w:hAnsi="EB Garamond" w:eastAsia="EB Garamond" w:cs="EB Garamond"/>
-          <w:b w:val="1"/>
-          <w:bCs w:val="1"/>
-        </w:rPr>
-      </w:pPr>
-      <w:r>
-        <w:rPr>
-          <w:rStyle w:val="SubtitleChar"/>
-          <w:b w:val="1"/>
-          <w:bCs w:val="1"/>
+          <w:rFonts w:ascii="EB Garamond" w:eastAsia="EB Garamond" w:hAnsi="EB Garamond" w:cs="EB Garamond"/>
+          <w:b/>
+          <w:bCs/>
+        </w:rPr>
+      </w:pPr>
+      <w:r>
+        <w:rPr>
+          <w:rStyle w:val="AlcmChar"/>
+          <w:b/>
+          <w:bCs/>
         </w:rPr>
         <w:t>Játékosok és pontozás</w:t>
       </w:r>
     </w:p>
-    <w:p xmlns:wp14="http://schemas.microsoft.com/office/word/2010/wordml" wp14:paraId="65E1F1A0" wp14:textId="64AEE149">
-      <w:pPr>
-        <w:pStyle w:val="Normal"/>
-        <w:spacing w:after="120" w:afterAutospacing="off" w:line="240" w:lineRule="auto"/>
+    <w:p>
+      <w:pPr>
+        <w:spacing w:after="120" w:line="240" w:lineRule="auto"/>
         <w:jc w:val="both"/>
         <w:rPr>
-          <w:rFonts w:ascii="EB Garamond" w:hAnsi="EB Garamond" w:eastAsia="EB Garamond" w:cs="EB Garamond"/>
-        </w:rPr>
-      </w:pPr>
-      <w:r>
-        <w:rPr>
-          <w:rFonts w:ascii="EB Garamond" w:hAnsi="EB Garamond" w:eastAsia="EB Garamond" w:cs="EB Garamond"/>
+          <w:rFonts w:ascii="EB Garamond" w:eastAsia="EB Garamond" w:hAnsi="EB Garamond" w:cs="EB Garamond"/>
+        </w:rPr>
+      </w:pPr>
+      <w:r>
+        <w:rPr>
+          <w:rFonts w:ascii="EB Garamond" w:eastAsia="EB Garamond" w:hAnsi="EB Garamond" w:cs="EB Garamond"/>
         </w:rPr>
         <w:t>A padelt jellemzően párosban játsszák (két játékos a háló egyik oldalán, két játékos a másikon). A pontozás rendszere megegyezik a teniszével (15, 30, 40, játék, szett, mérkőzés). A mérkőzés általában két nyert szettig tart.</w:t>
       </w:r>
     </w:p>
-    <w:p xmlns:wp14="http://schemas.microsoft.com/office/word/2010/wordml" wp14:paraId="5D9C7776" wp14:textId="43FC19A9">
-      <w:pPr>
-        <w:pStyle w:val="Subtitle"/>
-        <w:rPr>
-          <w:rFonts w:ascii="EB Garamond" w:hAnsi="EB Garamond" w:eastAsia="EB Garamond" w:cs="EB Garamond"/>
-          <w:b w:val="1"/>
-          <w:bCs w:val="1"/>
-        </w:rPr>
-      </w:pPr>
-      <w:r>
-        <w:rPr>
-          <w:b w:val="1"/>
-          <w:bCs w:val="1"/>
+    <w:p>
+      <w:pPr>
+        <w:pStyle w:val="Alcm"/>
+        <w:rPr>
+          <w:b/>
+          <w:bCs/>
+        </w:rPr>
+      </w:pPr>
+      <w:r>
+        <w:rPr>
+          <w:b/>
+          <w:bCs/>
         </w:rPr>
         <w:t>Adogatás</w:t>
       </w:r>
     </w:p>
-    <w:p xmlns:wp14="http://schemas.microsoft.com/office/word/2010/wordml" wp14:paraId="4F4409CF" wp14:textId="017831E0">
-      <w:pPr>
-        <w:pStyle w:val="Normal"/>
-        <w:spacing w:after="120" w:afterAutospacing="off" w:line="240" w:lineRule="auto"/>
+    <w:p>
+      <w:pPr>
+        <w:spacing w:after="120" w:line="240" w:lineRule="auto"/>
         <w:jc w:val="both"/>
         <w:rPr>
-          <w:rFonts w:ascii="EB Garamond" w:hAnsi="EB Garamond" w:eastAsia="EB Garamond" w:cs="EB Garamond"/>
-        </w:rPr>
-      </w:pPr>
-      <w:r>
-        <w:rPr>
-          <w:rFonts w:ascii="EB Garamond" w:hAnsi="EB Garamond" w:eastAsia="EB Garamond" w:cs="EB Garamond"/>
+          <w:rFonts w:ascii="EB Garamond" w:eastAsia="EB Garamond" w:hAnsi="EB Garamond" w:cs="EB Garamond"/>
+        </w:rPr>
+      </w:pPr>
+      <w:r>
+        <w:rPr>
+          <w:rFonts w:ascii="EB Garamond" w:eastAsia="EB Garamond" w:hAnsi="EB Garamond" w:cs="EB Garamond"/>
         </w:rPr>
         <w:t>Az adogatás a padel egyik kulcsfontosságú eleme. Az adogatónak a saját adogatómezőjében kell állnia, és a labdát a derékvonal alatt kell elütnie, miután egyszer lepattant a földön. A labdának át kell mennie a háló felett, és az ellenfél adogatómezőjében kell lepattannia. Ha a labda lepattan a falról az ellenfél térfelén, az érvényes, de ha az ellenfél térfelén direktben falba csapódik, az hiba.</w:t>
       </w:r>
     </w:p>
-    <w:p xmlns:wp14="http://schemas.microsoft.com/office/word/2010/wordml" wp14:paraId="43AAD508" wp14:textId="0C170BAF">
-      <w:pPr>
-        <w:pStyle w:val="Subtitle"/>
-        <w:rPr>
-          <w:rFonts w:ascii="EB Garamond" w:hAnsi="EB Garamond" w:eastAsia="EB Garamond" w:cs="EB Garamond"/>
-          <w:b w:val="1"/>
-          <w:bCs w:val="1"/>
-        </w:rPr>
-      </w:pPr>
-      <w:r>
-        <w:rPr>
-          <w:b w:val="1"/>
-          <w:bCs w:val="1"/>
+    <w:p>
+      <w:pPr>
+        <w:pStyle w:val="Alcm"/>
+        <w:rPr>
+          <w:b/>
+          <w:bCs/>
+        </w:rPr>
+      </w:pPr>
+      <w:r>
+        <w:rPr>
+          <w:b/>
+          <w:bCs/>
         </w:rPr>
         <w:t>Játék a falakkal</w:t>
       </w:r>
     </w:p>
-    <w:p xmlns:wp14="http://schemas.microsoft.com/office/word/2010/wordml" wp14:paraId="612904D1" wp14:textId="58EEBFA1">
-      <w:pPr>
-        <w:pStyle w:val="Normal"/>
-        <w:spacing w:after="120" w:afterAutospacing="off" w:line="240" w:lineRule="auto"/>
+    <w:p>
+      <w:pPr>
+        <w:spacing w:after="120" w:line="240" w:lineRule="auto"/>
         <w:jc w:val="both"/>
         <w:rPr>
-          <w:rFonts w:ascii="EB Garamond" w:hAnsi="EB Garamond" w:eastAsia="EB Garamond" w:cs="EB Garamond"/>
-        </w:rPr>
-      </w:pPr>
-      <w:r>
-        <w:rPr>
-          <w:rFonts w:ascii="EB Garamond" w:hAnsi="EB Garamond" w:eastAsia="EB Garamond" w:cs="EB Garamond"/>
+          <w:rFonts w:ascii="EB Garamond" w:eastAsia="EB Garamond" w:hAnsi="EB Garamond" w:cs="EB Garamond"/>
+        </w:rPr>
+      </w:pPr>
+      <w:r>
+        <w:rPr>
+          <w:rFonts w:ascii="EB Garamond" w:eastAsia="EB Garamond" w:hAnsi="EB Garamond" w:cs="EB Garamond"/>
         </w:rPr>
         <w:t>Ez az, ami igazán különlegessé teszi a padelt: a falak aktívan részt vesznek a játékban. Miután a labda lepattant a pályán, pattanhat a falról, mielőtt visszaütnék. Ez hosszabb labdameneteket és izgalmas stratégiai lehetőségeket eredményez. A labda kétszer pattanhat le a földön, mielőtt visszaütnék, de ha egyszer lepattant a földön, és utána a falról pattanva a pályán belül másodszor is lepattan, az már pontvesztés.</w:t>
       </w:r>
     </w:p>
-    <w:p xmlns:wp14="http://schemas.microsoft.com/office/word/2010/wordml" wp14:paraId="646696E2" wp14:textId="0BECEFF7">
-      <w:pPr>
-        <w:pStyle w:val="Normal"/>
-        <w:spacing w:before="120" w:beforeAutospacing="off" w:after="120" w:afterAutospacing="off" w:line="240" w:lineRule="auto"/>
+    <w:p>
+      <w:pPr>
+        <w:spacing w:before="120" w:after="120" w:line="240" w:lineRule="auto"/>
         <w:jc w:val="both"/>
         <w:rPr>
-          <w:rFonts w:ascii="EB Garamond" w:hAnsi="EB Garamond" w:eastAsia="EB Garamond" w:cs="EB Garamond"/>
-        </w:rPr>
-      </w:pPr>
-      <w:r>
-        <w:rPr>
-          <w:rStyle w:val="SubtitleChar"/>
-          <w:b w:val="1"/>
-          <w:bCs w:val="1"/>
+          <w:rFonts w:ascii="EB Garamond" w:eastAsia="EB Garamond" w:hAnsi="EB Garamond" w:cs="EB Garamond"/>
+        </w:rPr>
+      </w:pPr>
+      <w:r>
+        <w:rPr>
+          <w:rStyle w:val="AlcmChar"/>
+          <w:b/>
+          <w:bCs/>
         </w:rPr>
         <w:t>Egyéb fontos szabályok</w:t>
       </w:r>
     </w:p>
-    <w:p xmlns:wp14="http://schemas.microsoft.com/office/word/2010/wordml" wp14:paraId="5B6643A5" wp14:textId="69FAF52F">
-      <w:pPr>
-        <w:pStyle w:val="ListParagraph"/>
+    <w:p>
+      <w:pPr>
+        <w:pStyle w:val="Listaszerbekezds"/>
         <w:numPr>
           <w:ilvl w:val="0"/>
           <w:numId w:val="1"/>
         </w:numPr>
-        <w:spacing w:after="120" w:afterAutospacing="off" w:line="240" w:lineRule="auto"/>
+        <w:spacing w:after="120" w:line="240" w:lineRule="auto"/>
         <w:jc w:val="both"/>
         <w:rPr>
-          <w:rFonts w:ascii="EB Garamond" w:hAnsi="EB Garamond" w:eastAsia="EB Garamond" w:cs="EB Garamond"/>
-        </w:rPr>
-      </w:pPr>
-      <w:r>
-        <w:rPr>
-          <w:rFonts w:ascii="EB Garamond" w:hAnsi="EB Garamond" w:eastAsia="EB Garamond" w:cs="EB Garamond"/>
-        </w:rPr>
+          <w:rFonts w:ascii="EB Garamond" w:eastAsia="EB Garamond" w:hAnsi="EB Garamond" w:cs="EB Garamond"/>
+        </w:rPr>
+      </w:pPr>
+      <w:r>
+        <w:rPr>
+          <w:rFonts w:ascii="EB Garamond" w:eastAsia="EB Garamond" w:hAnsi="EB Garamond" w:cs="EB Garamond"/>
+        </w:rPr>
+        <w:lastRenderedPageBreak/>
         <w:t xml:space="preserve">    A labda csak egyszer pattanhat le a saját térfélen.</w:t>
       </w:r>
     </w:p>
-    <w:p xmlns:wp14="http://schemas.microsoft.com/office/word/2010/wordml" wp14:paraId="3A471042" wp14:textId="1A1B875D">
-      <w:pPr>
-        <w:pStyle w:val="ListParagraph"/>
+    <w:p>
+      <w:pPr>
+        <w:pStyle w:val="Listaszerbekezds"/>
         <w:numPr>
           <w:ilvl w:val="0"/>
           <w:numId w:val="1"/>
         </w:numPr>
-        <w:spacing w:after="120" w:afterAutospacing="off" w:line="240" w:lineRule="auto"/>
+        <w:spacing w:after="120" w:line="240" w:lineRule="auto"/>
         <w:jc w:val="both"/>
         <w:rPr>
-          <w:rFonts w:ascii="EB Garamond" w:hAnsi="EB Garamond" w:eastAsia="EB Garamond" w:cs="EB Garamond"/>
-        </w:rPr>
-      </w:pPr>
-      <w:r>
-        <w:rPr>
-          <w:rFonts w:ascii="EB Garamond" w:hAnsi="EB Garamond" w:eastAsia="EB Garamond" w:cs="EB Garamond"/>
+          <w:rFonts w:ascii="EB Garamond" w:eastAsia="EB Garamond" w:hAnsi="EB Garamond" w:cs="EB Garamond"/>
+        </w:rPr>
+      </w:pPr>
+      <w:r>
+        <w:rPr>
+          <w:rFonts w:ascii="EB Garamond" w:eastAsia="EB Garamond" w:hAnsi="EB Garamond" w:cs="EB Garamond"/>
         </w:rPr>
         <w:t xml:space="preserve">    A játékosok elüthetik a labdát, mielőtt az a falról lepattanna (röptézés), kivéve az adogatásnál.</w:t>
       </w:r>
     </w:p>
-    <w:p xmlns:wp14="http://schemas.microsoft.com/office/word/2010/wordml" wp14:paraId="2F823FC4" wp14:textId="63C47F72">
-      <w:pPr>
-        <w:pStyle w:val="ListParagraph"/>
+    <w:p>
+      <w:pPr>
+        <w:pStyle w:val="Listaszerbekezds"/>
         <w:numPr>
           <w:ilvl w:val="0"/>
           <w:numId w:val="1"/>
         </w:numPr>
-        <w:spacing w:after="120" w:afterAutospacing="off" w:line="240" w:lineRule="auto"/>
+        <w:spacing w:after="120" w:line="240" w:lineRule="auto"/>
         <w:jc w:val="both"/>
         <w:rPr>
-          <w:rFonts w:ascii="EB Garamond" w:hAnsi="EB Garamond" w:eastAsia="EB Garamond" w:cs="EB Garamond"/>
-        </w:rPr>
-      </w:pPr>
-      <w:r>
-        <w:rPr>
-          <w:rFonts w:ascii="EB Garamond" w:hAnsi="EB Garamond" w:eastAsia="EB Garamond" w:cs="EB Garamond"/>
+          <w:rFonts w:ascii="EB Garamond" w:eastAsia="EB Garamond" w:hAnsi="EB Garamond" w:cs="EB Garamond"/>
+        </w:rPr>
+      </w:pPr>
+      <w:r>
+        <w:rPr>
+          <w:rFonts w:ascii="EB Garamond" w:eastAsia="EB Garamond" w:hAnsi="EB Garamond" w:cs="EB Garamond"/>
         </w:rPr>
         <w:t xml:space="preserve">    Ha a labda a saját térfél falán pattan le, mielőtt az ellenfél térfelén lepattanna, az hiba.</w:t>
       </w:r>
     </w:p>
-    <w:p xmlns:wp14="http://schemas.microsoft.com/office/word/2010/wordml" wp14:paraId="29B63463" wp14:textId="1FC8248E">
-      <w:pPr>
-        <w:pStyle w:val="Normal"/>
-        <w:spacing w:after="120" w:afterAutospacing="off" w:line="240" w:lineRule="auto"/>
+    <w:p>
+      <w:pPr>
+        <w:spacing w:after="120" w:line="240" w:lineRule="auto"/>
         <w:jc w:val="both"/>
         <w:rPr>
-          <w:rFonts w:ascii="EB Garamond" w:hAnsi="EB Garamond" w:eastAsia="EB Garamond" w:cs="EB Garamond"/>
-        </w:rPr>
-      </w:pPr>
-      <w:r>
-        <w:rPr>
-          <w:rFonts w:ascii="EB Garamond" w:hAnsi="EB Garamond" w:eastAsia="EB Garamond" w:cs="EB Garamond"/>
-        </w:rPr>
-        <w:t xml:space="preserve">A </w:t>
-      </w:r>
-      <w:r>
-        <w:rPr>
-          <w:rFonts w:ascii="EB Garamond" w:hAnsi="EB Garamond" w:eastAsia="EB Garamond" w:cs="EB Garamond"/>
-        </w:rPr>
-        <w:t>padel</w:t>
-      </w:r>
-      <w:r>
-        <w:rPr>
-          <w:rFonts w:ascii="EB Garamond" w:hAnsi="EB Garamond" w:eastAsia="EB Garamond" w:cs="EB Garamond"/>
-        </w:rPr>
-        <w:t xml:space="preserve"> egy rendkívül szórakoztató és kihívásokkal teli sport, amely kiválóan alkalmas barátokkal vagy családdal való kikapcsolódásra. Könnyen tanulható, de a benne rejlő taktikai mélység hosszú távon is fenntartja az érdeklődést. Ha még nem próbáltad, érdemes belevágni!</w:t>
-      </w:r>
+          <w:rFonts w:ascii="EB Garamond" w:eastAsia="EB Garamond" w:hAnsi="EB Garamond" w:cs="EB Garamond"/>
+        </w:rPr>
+      </w:pPr>
+      <w:r>
+        <w:rPr>
+          <w:rFonts w:ascii="EB Garamond" w:eastAsia="EB Garamond" w:hAnsi="EB Garamond" w:cs="EB Garamond"/>
+        </w:rPr>
+        <w:t>A padel egy rendkívül szórakoztató és kihívásokkal teli sport, amely kiválóan alkalmas barátokkal vagy családdal való kikapcsolódásra. Könnyen tanulható, de a benne rejlő taktikai mélység hosszú távon is fenntartja az érdeklődést. Ha még nem próbáltad, érdemes belevágni!</w:t>
+      </w:r>
+    </w:p>
+    <w:p>
+      <w:pPr>
+        <w:rPr>
+          <w:rFonts w:ascii="EB Garamond" w:eastAsia="EB Garamond" w:hAnsi="EB Garamond" w:cs="EB Garamond"/>
+        </w:rPr>
+      </w:pPr>
+    </w:p>
+    <w:p>
+      <w:pPr>
+        <w:rPr>
+          <w:rFonts w:ascii="EB Garamond" w:eastAsia="EB Garamond" w:hAnsi="EB Garamond" w:cs="EB Garamond"/>
+        </w:rPr>
+      </w:pPr>
+    </w:p>
+    <w:p>
+      <w:pPr>
+        <w:rPr>
+          <w:rFonts w:ascii="EB Garamond" w:eastAsia="EB Garamond" w:hAnsi="EB Garamond" w:cs="EB Garamond"/>
+        </w:rPr>
+      </w:pPr>
+    </w:p>
+    <w:p>
+      <w:pPr>
+        <w:rPr>
+          <w:rFonts w:ascii="EB Garamond" w:eastAsia="EB Garamond" w:hAnsi="EB Garamond" w:cs="EB Garamond"/>
+        </w:rPr>
+      </w:pPr>
+    </w:p>
+    <w:p>
+      <w:pPr>
+        <w:rPr>
+          <w:rFonts w:ascii="EB Garamond" w:eastAsia="EB Garamond" w:hAnsi="EB Garamond" w:cs="EB Garamond"/>
+        </w:rPr>
+      </w:pPr>
+    </w:p>
+    <w:p>
+      <w:pPr>
+        <w:rPr>
+          <w:rFonts w:ascii="EB Garamond" w:eastAsia="EB Garamond" w:hAnsi="EB Garamond" w:cs="EB Garamond"/>
+        </w:rPr>
+      </w:pPr>
+    </w:p>
+    <w:p>
+      <w:pPr>
+        <w:rPr>
+          <w:rFonts w:ascii="EB Garamond" w:eastAsia="EB Garamond" w:hAnsi="EB Garamond" w:cs="EB Garamond"/>
+        </w:rPr>
+      </w:pPr>
+    </w:p>
+    <w:p>
+      <w:pPr>
+        <w:rPr>
+          <w:rFonts w:ascii="EB Garamond" w:eastAsia="EB Garamond" w:hAnsi="EB Garamond" w:cs="EB Garamond"/>
+        </w:rPr>
+      </w:pPr>
+    </w:p>
+    <w:p>
+      <w:pPr>
+        <w:rPr>
+          <w:rFonts w:ascii="EB Garamond" w:eastAsia="EB Garamond" w:hAnsi="EB Garamond" w:cs="EB Garamond"/>
+        </w:rPr>
+      </w:pPr>
+    </w:p>
+    <w:p>
+      <w:pPr>
+        <w:rPr>
+          <w:rFonts w:ascii="EB Garamond" w:eastAsia="EB Garamond" w:hAnsi="EB Garamond" w:cs="EB Garamond"/>
+        </w:rPr>
+      </w:pPr>
+    </w:p>
+    <w:p>
+      <w:pPr>
+        <w:rPr>
+          <w:rFonts w:ascii="EB Garamond" w:eastAsia="EB Garamond" w:hAnsi="EB Garamond" w:cs="EB Garamond"/>
+        </w:rPr>
+      </w:pPr>
+    </w:p>
+    <w:p>
+      <w:pPr>
+        <w:rPr>
+          <w:rFonts w:ascii="EB Garamond" w:eastAsia="EB Garamond" w:hAnsi="EB Garamond" w:cs="EB Garamond"/>
+        </w:rPr>
+      </w:pPr>
+    </w:p>
+    <w:p>
+      <w:pPr>
+        <w:rPr>
+          <w:rFonts w:ascii="EB Garamond" w:eastAsia="EB Garamond" w:hAnsi="EB Garamond" w:cs="EB Garamond"/>
+        </w:rPr>
+      </w:pPr>
+    </w:p>
+    <w:p>
+      <w:pPr>
+        <w:rPr>
+          <w:rFonts w:ascii="EB Garamond" w:eastAsia="EB Garamond" w:hAnsi="EB Garamond" w:cs="EB Garamond"/>
+        </w:rPr>
+      </w:pPr>
+    </w:p>
+    <w:p>
+      <w:pPr>
+        <w:rPr>
+          <w:rFonts w:ascii="EB Garamond" w:eastAsia="EB Garamond" w:hAnsi="EB Garamond" w:cs="EB Garamond"/>
+        </w:rPr>
+      </w:pPr>
+    </w:p>
+    <w:p>
+      <w:pPr>
+        <w:rPr>
+          <w:rFonts w:ascii="EB Garamond" w:eastAsia="EB Garamond" w:hAnsi="EB Garamond" w:cs="EB Garamond"/>
+        </w:rPr>
+      </w:pPr>
+    </w:p>
+    <w:p>
+      <w:pPr>
+        <w:rPr>
+          <w:rFonts w:ascii="EB Garamond" w:eastAsia="EB Garamond" w:hAnsi="EB Garamond" w:cs="EB Garamond"/>
+        </w:rPr>
+      </w:pPr>
+    </w:p>
+    <w:p>
+      <w:pPr>
+        <w:rPr>
+          <w:rFonts w:ascii="EB Garamond" w:eastAsia="EB Garamond" w:hAnsi="EB Garamond" w:cs="EB Garamond"/>
+        </w:rPr>
+      </w:pPr>
+    </w:p>
+    <w:p>
+      <w:pPr>
+        <w:rPr>
+          <w:rFonts w:ascii="EB Garamond" w:eastAsia="EB Garamond" w:hAnsi="EB Garamond" w:cs="EB Garamond"/>
+        </w:rPr>
+      </w:pPr>
+    </w:p>
+    <w:p>
+      <w:pPr>
+        <w:rPr>
+          <w:rFonts w:ascii="EB Garamond" w:eastAsia="EB Garamond" w:hAnsi="EB Garamond" w:cs="EB Garamond"/>
+        </w:rPr>
+      </w:pPr>
+    </w:p>
+    <w:p>
+      <w:pPr>
+        <w:jc w:val="center"/>
+        <w:rPr>
+          <w:rFonts w:ascii="EB Garamond" w:eastAsia="EB Garamond" w:hAnsi="EB Garamond" w:cs="EB Garamond"/>
+        </w:rPr>
+      </w:pPr>
     </w:p>
     <w:sectPr>
-      <w:pgSz w:w="11907" w:h="16839" w:orient="portrait"/>
+      <w:headerReference w:type="default" r:id="rId11"/>
+      <w:footerReference w:type="default" r:id="rId12"/>
+      <w:pgSz w:w="11907" w:h="16839"/>
       <w:pgMar w:top="1134" w:right="1304" w:bottom="1134" w:left="1304" w:header="708" w:footer="708" w:gutter="0"/>
       <w:cols w:space="708"/>
       <w:docGrid w:linePitch="360"/>
-      <w:headerReference w:type="default" r:id="R82d87e4b4249401c"/>
-      <w:footerReference w:type="default" r:id="Rd41f1e4a21364078"/>
     </w:sectPr>
   </w:body>
 </w:document>
 </file>
 
-<file path=word/footer.xml><?xml version="1.0" encoding="utf-8"?>
-<w:ftr xmlns:w14="http://schemas.microsoft.com/office/word/2010/wordml" xmlns:w="http://schemas.openxmlformats.org/wordprocessingml/2006/main">
-  <w:tbl>
-    <w:tblPr>
-      <w:tblStyle w:val="TableNormal"/>
-      <w:bidiVisual w:val="0"/>
-      <w:tblW w:w="0" w:type="auto"/>
-      <w:tblBorders>
-        <w:top w:val="single" w:color="000000" w:themeColor="text1" w:sz="12"/>
-      </w:tblBorders>
-      <w:tblLook w:val="06A0" w:firstRow="1" w:lastRow="0" w:firstColumn="1" w:lastColumn="0" w:noHBand="1" w:noVBand="1"/>
-    </w:tblPr>
-    <w:tblGrid>
-      <w:gridCol w:w="3095"/>
-      <w:gridCol w:w="3095"/>
-      <w:gridCol w:w="3095"/>
-    </w:tblGrid>
-    <w:tr>
-      <w:trPr>
-        <w:trHeight w:val="300"/>
-      </w:trPr>
-      <w:tc>
-        <w:tcPr>
-          <w:tcW w:w="3095" w:type="dxa"/>
-          <w:tcMar/>
-        </w:tcPr>
-        <w:p>
-          <w:pPr>
-            <w:pStyle w:val="Header"/>
-            <w:bidi w:val="0"/>
-            <w:ind w:left="-115"/>
-            <w:jc w:val="left"/>
-          </w:pPr>
-        </w:p>
-        <w:p>
-          <w:pPr>
-            <w:pStyle w:val="Header"/>
-            <w:bidi w:val="0"/>
-            <w:ind w:left="-115"/>
-            <w:jc w:val="left"/>
-          </w:pPr>
-        </w:p>
-      </w:tc>
-      <w:tc>
-        <w:tcPr>
-          <w:tcW w:w="3095" w:type="dxa"/>
-          <w:tcMar/>
-        </w:tcPr>
-        <w:p>
-          <w:pPr>
-            <w:pStyle w:val="Header"/>
-            <w:bidi w:val="0"/>
-            <w:jc w:val="center"/>
-          </w:pPr>
-        </w:p>
-      </w:tc>
-      <w:tc>
-        <w:tcPr>
-          <w:tcW w:w="3095" w:type="dxa"/>
-          <w:tcMar/>
-        </w:tcPr>
-        <w:p>
-          <w:pPr>
-            <w:pStyle w:val="Header"/>
-            <w:bidi w:val="0"/>
-            <w:ind w:right="-115"/>
-            <w:jc w:val="right"/>
-          </w:pPr>
-        </w:p>
-      </w:tc>
-    </w:tr>
-  </w:tbl>
+<file path=word/endnotes.xml><?xml version="1.0" encoding="utf-8"?>
+<w:endnotes xmlns:wpc="http://schemas.microsoft.com/office/word/2010/wordprocessingCanvas" xmlns:cx="http://schemas.microsoft.com/office/drawing/2014/chartex" xmlns:cx1="http://schemas.microsoft.com/office/drawing/2015/9/8/chartex" xmlns:cx2="http://schemas.microsoft.com/office/drawing/2015/10/21/chartex" xmlns:cx3="http://schemas.microsoft.com/office/drawing/2016/5/9/chartex" xmlns:cx4="http://schemas.microsoft.com/office/drawing/2016/5/10/chartex" xmlns:cx5="http://schemas.microsoft.com/office/drawing/2016/5/11/chartex" xmlns:cx6="http://schemas.microsoft.com/office/drawing/2016/5/12/chartex" xmlns:cx7="http://schemas.microsoft.com/office/drawing/2016/5/13/chartex" xmlns:cx8="http://schemas.microsoft.com/office/drawing/2016/5/14/chartex" xmlns:mc="http://schemas.openxmlformats.org/markup-compatibility/2006" xmlns:aink="http://schemas.microsoft.com/office/drawing/2016/ink" xmlns:am3d="http://schemas.microsoft.com/office/drawing/2017/model3d" xmlns:o="urn:schemas-microsoft-com:office:office" xmlns:r="http://schemas.openxmlformats.org/officeDocument/2006/relationships" xmlns:m="http://schemas.openxmlformats.org/officeDocument/2006/math" xmlns:v="urn:schemas-microsoft-com:vml" xmlns:wp14="http://schemas.microsoft.com/office/word/2010/wordprocessingDrawing" xmlns:wp="http://schemas.openxmlformats.org/drawingml/2006/wordprocessingDrawing" xmlns:w10="urn:schemas-microsoft-com:office:word" xmlns:w="http://schemas.openxmlformats.org/wordprocessingml/2006/main" xmlns:w14="http://schemas.microsoft.com/office/word/2010/wordml" xmlns:w15="http://schemas.microsoft.com/office/word/2012/wordml" xmlns:w16cex="http://schemas.microsoft.com/office/word/2018/wordml/cex" xmlns:w16cid="http://schemas.microsoft.com/office/word/2016/wordml/cid" xmlns:w16="http://schemas.microsoft.com/office/word/2018/wordml" xmlns:w16sdtdh="http://schemas.microsoft.com/office/word/2020/wordml/sdtdatahash" xmlns:w16se="http://schemas.microsoft.com/office/word/2015/wordml/symex" xmlns:wpg="http://schemas.microsoft.com/office/word/2010/wordprocessingGroup" xmlns:wpi="http://schemas.microsoft.com/office/word/2010/wordprocessingInk" xmlns:wne="http://schemas.microsoft.com/office/word/2006/wordml" xmlns:wps="http://schemas.microsoft.com/office/word/2010/wordprocessingShape" mc:Ignorable="w14 w15 w16se w16cid w16 w16cex w16sdtdh wp14">
+  <w:endnote w:type="separator" w:id="-1">
+    <w:p>
+      <w:pPr>
+        <w:spacing w:after="0" w:line="240" w:lineRule="auto"/>
+      </w:pPr>
+      <w:r>
+        <w:separator/>
+      </w:r>
+    </w:p>
+  </w:endnote>
+  <w:endnote w:type="continuationSeparator" w:id="0">
+    <w:p>
+      <w:pPr>
+        <w:spacing w:after="0" w:line="240" w:lineRule="auto"/>
+      </w:pPr>
+      <w:r>
+        <w:continuationSeparator/>
+      </w:r>
+    </w:p>
+  </w:endnote>
+</w:endnotes>
+</file>
+
+<file path=word/footer1.xml><?xml version="1.0" encoding="utf-8"?>
+<w:ftr xmlns:wpc="http://schemas.microsoft.com/office/word/2010/wordprocessingCanvas" xmlns:cx="http://schemas.microsoft.com/office/drawing/2014/chartex" xmlns:cx1="http://schemas.microsoft.com/office/drawing/2015/9/8/chartex" xmlns:cx2="http://schemas.microsoft.com/office/drawing/2015/10/21/chartex" xmlns:cx3="http://schemas.microsoft.com/office/drawing/2016/5/9/chartex" xmlns:cx4="http://schemas.microsoft.com/office/drawing/2016/5/10/chartex" xmlns:cx5="http://schemas.microsoft.com/office/drawing/2016/5/11/chartex" xmlns:cx6="http://schemas.microsoft.com/office/drawing/2016/5/12/chartex" xmlns:cx7="http://schemas.microsoft.com/office/drawing/2016/5/13/chartex" xmlns:cx8="http://schemas.microsoft.com/office/drawing/2016/5/14/chartex" xmlns:mc="http://schemas.openxmlformats.org/markup-compatibility/2006" xmlns:aink="http://schemas.microsoft.com/office/drawing/2016/ink" xmlns:am3d="http://schemas.microsoft.com/office/drawing/2017/model3d" xmlns:o="urn:schemas-microsoft-com:office:office" xmlns:r="http://schemas.openxmlformats.org/officeDocument/2006/relationships" xmlns:m="http://schemas.openxmlformats.org/officeDocument/2006/math" xmlns:v="urn:schemas-microsoft-com:vml" xmlns:wp14="http://schemas.microsoft.com/office/word/2010/wordprocessingDrawing" xmlns:wp="http://schemas.openxmlformats.org/drawingml/2006/wordprocessingDrawing" xmlns:w10="urn:schemas-microsoft-com:office:word" xmlns:w="http://schemas.openxmlformats.org/wordprocessingml/2006/main" xmlns:w14="http://schemas.microsoft.com/office/word/2010/wordml" xmlns:w15="http://schemas.microsoft.com/office/word/2012/wordml" xmlns:w16cex="http://schemas.microsoft.com/office/word/2018/wordml/cex" xmlns:w16cid="http://schemas.microsoft.com/office/word/2016/wordml/cid" xmlns:w16="http://schemas.microsoft.com/office/word/2018/wordml" xmlns:w16sdtdh="http://schemas.microsoft.com/office/word/2020/wordml/sdtdatahash" xmlns:w16se="http://schemas.microsoft.com/office/word/2015/wordml/symex" xmlns:wpg="http://schemas.microsoft.com/office/word/2010/wordprocessingGroup" xmlns:wpi="http://schemas.microsoft.com/office/word/2010/wordprocessingInk" xmlns:wne="http://schemas.microsoft.com/office/word/2006/wordml" xmlns:wps="http://schemas.microsoft.com/office/word/2010/wordprocessingShape" mc:Ignorable="w14 w15 w16se w16cid w16 w16cex w16sdtdh wp14">
+  <w:sdt>
+    <w:sdtPr>
+      <w:id w:val="-117298917"/>
+      <w:docPartObj>
+        <w:docPartGallery w:val="Page Numbers (Bottom of Page)"/>
+        <w:docPartUnique/>
+      </w:docPartObj>
+    </w:sdtPr>
+    <w:sdtContent>
+      <w:p>
+        <w:pPr>
+          <w:pStyle w:val="llb"/>
+          <w:jc w:val="center"/>
+        </w:pPr>
+        <w:r>
+          <w:fldChar w:fldCharType="begin"/>
+        </w:r>
+        <w:r>
+          <w:instrText>PAGE   \* MERGEFORMAT</w:instrText>
+        </w:r>
+        <w:r>
+          <w:fldChar w:fldCharType="separate"/>
+        </w:r>
+        <w:r>
+          <w:t>2</w:t>
+        </w:r>
+        <w:r>
+          <w:fldChar w:fldCharType="end"/>
+        </w:r>
+      </w:p>
+    </w:sdtContent>
+  </w:sdt>
   <w:p>
     <w:pPr>
-      <w:pStyle w:val="Footer"/>
-      <w:bidi w:val="0"/>
+      <w:pStyle w:val="llb"/>
     </w:pPr>
   </w:p>
 </w:ftr>
 </file>
 
-<file path=word/header.xml><?xml version="1.0" encoding="utf-8"?>
-<w:hdr xmlns:w14="http://schemas.microsoft.com/office/word/2010/wordml" xmlns:w="http://schemas.openxmlformats.org/wordprocessingml/2006/main">
+<file path=word/footnotes.xml><?xml version="1.0" encoding="utf-8"?>
+<w:footnotes xmlns:wpc="http://schemas.microsoft.com/office/word/2010/wordprocessingCanvas" xmlns:cx="http://schemas.microsoft.com/office/drawing/2014/chartex" xmlns:cx1="http://schemas.microsoft.com/office/drawing/2015/9/8/chartex" xmlns:cx2="http://schemas.microsoft.com/office/drawing/2015/10/21/chartex" xmlns:cx3="http://schemas.microsoft.com/office/drawing/2016/5/9/chartex" xmlns:cx4="http://schemas.microsoft.com/office/drawing/2016/5/10/chartex" xmlns:cx5="http://schemas.microsoft.com/office/drawing/2016/5/11/chartex" xmlns:cx6="http://schemas.microsoft.com/office/drawing/2016/5/12/chartex" xmlns:cx7="http://schemas.microsoft.com/office/drawing/2016/5/13/chartex" xmlns:cx8="http://schemas.microsoft.com/office/drawing/2016/5/14/chartex" xmlns:mc="http://schemas.openxmlformats.org/markup-compatibility/2006" xmlns:aink="http://schemas.microsoft.com/office/drawing/2016/ink" xmlns:am3d="http://schemas.microsoft.com/office/drawing/2017/model3d" xmlns:o="urn:schemas-microsoft-com:office:office" xmlns:r="http://schemas.openxmlformats.org/officeDocument/2006/relationships" xmlns:m="http://schemas.openxmlformats.org/officeDocument/2006/math" xmlns:v="urn:schemas-microsoft-com:vml" xmlns:wp14="http://schemas.microsoft.com/office/word/2010/wordprocessingDrawing" xmlns:wp="http://schemas.openxmlformats.org/drawingml/2006/wordprocessingDrawing" xmlns:w10="urn:schemas-microsoft-com:office:word" xmlns:w="http://schemas.openxmlformats.org/wordprocessingml/2006/main" xmlns:w14="http://schemas.microsoft.com/office/word/2010/wordml" xmlns:w15="http://schemas.microsoft.com/office/word/2012/wordml" xmlns:w16cex="http://schemas.microsoft.com/office/word/2018/wordml/cex" xmlns:w16cid="http://schemas.microsoft.com/office/word/2016/wordml/cid" xmlns:w16="http://schemas.microsoft.com/office/word/2018/wordml" xmlns:w16sdtdh="http://schemas.microsoft.com/office/word/2020/wordml/sdtdatahash" xmlns:w16se="http://schemas.microsoft.com/office/word/2015/wordml/symex" xmlns:wpg="http://schemas.microsoft.com/office/word/2010/wordprocessingGroup" xmlns:wpi="http://schemas.microsoft.com/office/word/2010/wordprocessingInk" xmlns:wne="http://schemas.microsoft.com/office/word/2006/wordml" xmlns:wps="http://schemas.microsoft.com/office/word/2010/wordprocessingShape" mc:Ignorable="w14 w15 w16se w16cid w16 w16cex w16sdtdh wp14">
+  <w:footnote w:type="separator" w:id="-1">
+    <w:p>
+      <w:pPr>
+        <w:spacing w:after="0" w:line="240" w:lineRule="auto"/>
+      </w:pPr>
+      <w:r>
+        <w:separator/>
+      </w:r>
+    </w:p>
+  </w:footnote>
+  <w:footnote w:type="continuationSeparator" w:id="0">
+    <w:p>
+      <w:pPr>
+        <w:spacing w:after="0" w:line="240" w:lineRule="auto"/>
+      </w:pPr>
+      <w:r>
+        <w:continuationSeparator/>
+      </w:r>
+    </w:p>
+  </w:footnote>
+</w:footnotes>
+</file>
+
+<file path=word/header1.xml><?xml version="1.0" encoding="utf-8"?>
+<w:hdr xmlns:wpc="http://schemas.microsoft.com/office/word/2010/wordprocessingCanvas" xmlns:cx="http://schemas.microsoft.com/office/drawing/2014/chartex" xmlns:cx1="http://schemas.microsoft.com/office/drawing/2015/9/8/chartex" xmlns:cx2="http://schemas.microsoft.com/office/drawing/2015/10/21/chartex" xmlns:cx3="http://schemas.microsoft.com/office/drawing/2016/5/9/chartex" xmlns:cx4="http://schemas.microsoft.com/office/drawing/2016/5/10/chartex" xmlns:cx5="http://schemas.microsoft.com/office/drawing/2016/5/11/chartex" xmlns:cx6="http://schemas.microsoft.com/office/drawing/2016/5/12/chartex" xmlns:cx7="http://schemas.microsoft.com/office/drawing/2016/5/13/chartex" xmlns:cx8="http://schemas.microsoft.com/office/drawing/2016/5/14/chartex" xmlns:mc="http://schemas.openxmlformats.org/markup-compatibility/2006" xmlns:aink="http://schemas.microsoft.com/office/drawing/2016/ink" xmlns:am3d="http://schemas.microsoft.com/office/drawing/2017/model3d" xmlns:o="urn:schemas-microsoft-com:office:office" xmlns:r="http://schemas.openxmlformats.org/officeDocument/2006/relationships" xmlns:m="http://schemas.openxmlformats.org/officeDocument/2006/math" xmlns:v="urn:schemas-microsoft-com:vml" xmlns:wp14="http://schemas.microsoft.com/office/word/2010/wordprocessingDrawing" xmlns:wp="http://schemas.openxmlformats.org/drawingml/2006/wordprocessingDrawing" xmlns:w10="urn:schemas-microsoft-com:office:word" xmlns:w="http://schemas.openxmlformats.org/wordprocessingml/2006/main" xmlns:w14="http://schemas.microsoft.com/office/word/2010/wordml" xmlns:w15="http://schemas.microsoft.com/office/word/2012/wordml" xmlns:w16cex="http://schemas.microsoft.com/office/word/2018/wordml/cex" xmlns:w16cid="http://schemas.microsoft.com/office/word/2016/wordml/cid" xmlns:w16="http://schemas.microsoft.com/office/word/2018/wordml" xmlns:w16sdtdh="http://schemas.microsoft.com/office/word/2020/wordml/sdtdatahash" xmlns:w16se="http://schemas.microsoft.com/office/word/2015/wordml/symex" xmlns:wpg="http://schemas.microsoft.com/office/word/2010/wordprocessingGroup" xmlns:wpi="http://schemas.microsoft.com/office/word/2010/wordprocessingInk" xmlns:wne="http://schemas.microsoft.com/office/word/2006/wordml" xmlns:wps="http://schemas.microsoft.com/office/word/2010/wordprocessingShape" mc:Ignorable="w14 w15 w16se w16cid w16 w16cex w16sdtdh wp14">
   <w:tbl>
     <w:tblPr>
-      <w:tblStyle w:val="TableNormal"/>
-      <w:bidiVisual w:val="0"/>
       <w:tblW w:w="0" w:type="auto"/>
       <w:tblLook w:val="06A0" w:firstRow="1" w:lastRow="0" w:firstColumn="1" w:lastColumn="0" w:noHBand="1" w:noVBand="1"/>
     </w:tblPr>
@@ -961,16 +925,13 @@
         <w:tcPr>
           <w:tcW w:w="3095" w:type="dxa"/>
           <w:tcBorders>
-            <w:bottom w:val="single" w:color="000000" w:themeColor="text1" w:sz="12"/>
+            <w:bottom w:val="single" w:sz="12" w:space="0" w:color="000000" w:themeColor="text1"/>
           </w:tcBorders>
-          <w:tcMar/>
         </w:tcPr>
         <w:p>
           <w:pPr>
-            <w:pStyle w:val="Header"/>
-            <w:bidi w:val="0"/>
+            <w:pStyle w:val="lfej"/>
             <w:ind w:left="-115"/>
-            <w:jc w:val="left"/>
           </w:pPr>
         </w:p>
       </w:tc>
@@ -978,14 +939,12 @@
         <w:tcPr>
           <w:tcW w:w="3095" w:type="dxa"/>
           <w:tcBorders>
-            <w:bottom w:val="single" w:color="000000" w:themeColor="text1" w:sz="12"/>
+            <w:bottom w:val="single" w:sz="12" w:space="0" w:color="000000" w:themeColor="text1"/>
           </w:tcBorders>
-          <w:tcMar/>
         </w:tcPr>
         <w:p>
           <w:pPr>
-            <w:pStyle w:val="Header"/>
-            <w:bidi w:val="0"/>
+            <w:pStyle w:val="lfej"/>
             <w:jc w:val="center"/>
           </w:pPr>
         </w:p>
@@ -994,31 +953,30 @@
         <w:tcPr>
           <w:tcW w:w="3095" w:type="dxa"/>
           <w:tcBorders>
-            <w:bottom w:val="single" w:color="000000" w:themeColor="text1" w:sz="12"/>
+            <w:bottom w:val="single" w:sz="12" w:space="0" w:color="000000" w:themeColor="text1"/>
           </w:tcBorders>
-          <w:tcMar/>
         </w:tcPr>
         <w:p>
           <w:pPr>
-            <w:spacing w:before="120" w:beforeAutospacing="off" w:after="240" w:afterAutospacing="off" w:line="240" w:lineRule="auto"/>
+            <w:spacing w:before="120" w:after="240" w:line="240" w:lineRule="auto"/>
             <w:jc w:val="right"/>
             <w:rPr>
-              <w:rFonts w:ascii="EB Garamond" w:hAnsi="EB Garamond" w:eastAsia="EB Garamond" w:cs="EB Garamond"/>
-              <w:b w:val="1"/>
-              <w:bCs w:val="1"/>
-              <w:i w:val="1"/>
-              <w:iCs w:val="1"/>
+              <w:rFonts w:ascii="EB Garamond" w:eastAsia="EB Garamond" w:hAnsi="EB Garamond" w:cs="EB Garamond"/>
+              <w:b/>
+              <w:bCs/>
+              <w:i/>
+              <w:iCs/>
               <w:sz w:val="20"/>
               <w:szCs w:val="20"/>
             </w:rPr>
           </w:pPr>
           <w:r>
             <w:rPr>
-              <w:rFonts w:ascii="EB Garamond" w:hAnsi="EB Garamond" w:eastAsia="EB Garamond" w:cs="EB Garamond"/>
-              <w:b w:val="1"/>
-              <w:bCs w:val="1"/>
-              <w:i w:val="1"/>
-              <w:iCs w:val="1"/>
+              <w:rFonts w:ascii="EB Garamond" w:eastAsia="EB Garamond" w:hAnsi="EB Garamond" w:cs="EB Garamond"/>
+              <w:b/>
+              <w:bCs/>
+              <w:i/>
+              <w:iCs/>
               <w:sz w:val="20"/>
               <w:szCs w:val="20"/>
             </w:rPr>
@@ -1027,8 +985,7 @@
         </w:p>
         <w:p>
           <w:pPr>
-            <w:pStyle w:val="Header"/>
-            <w:bidi w:val="0"/>
+            <w:pStyle w:val="lfej"/>
             <w:ind w:right="-115"/>
             <w:jc w:val="right"/>
           </w:pPr>
@@ -1038,19 +995,19 @@
   </w:tbl>
   <w:p>
     <w:pPr>
-      <w:pStyle w:val="Header"/>
-      <w:bidi w:val="0"/>
+      <w:pStyle w:val="lfej"/>
     </w:pPr>
   </w:p>
 </w:hdr>
 </file>
 
 <file path=word/numbering.xml><?xml version="1.0" encoding="utf-8"?>
-<w:numbering xmlns:w="http://schemas.openxmlformats.org/wordprocessingml/2006/main">
-  <w:abstractNum xmlns:w="http://schemas.openxmlformats.org/wordprocessingml/2006/main" w:abstractNumId="1">
-    <w:nsid w:val="3dc5544f"/>
-    <w:multiLevelType xmlns:w="http://schemas.openxmlformats.org/wordprocessingml/2006/main" w:val="hybridMultilevel"/>
-    <w:lvl xmlns:w="http://schemas.openxmlformats.org/wordprocessingml/2006/main" w:ilvl="0">
+<w:numbering xmlns:wpc="http://schemas.microsoft.com/office/word/2010/wordprocessingCanvas" xmlns:cx="http://schemas.microsoft.com/office/drawing/2014/chartex" xmlns:cx1="http://schemas.microsoft.com/office/drawing/2015/9/8/chartex" xmlns:cx2="http://schemas.microsoft.com/office/drawing/2015/10/21/chartex" xmlns:cx3="http://schemas.microsoft.com/office/drawing/2016/5/9/chartex" xmlns:cx4="http://schemas.microsoft.com/office/drawing/2016/5/10/chartex" xmlns:cx5="http://schemas.microsoft.com/office/drawing/2016/5/11/chartex" xmlns:cx6="http://schemas.microsoft.com/office/drawing/2016/5/12/chartex" xmlns:cx7="http://schemas.microsoft.com/office/drawing/2016/5/13/chartex" xmlns:cx8="http://schemas.microsoft.com/office/drawing/2016/5/14/chartex" xmlns:mc="http://schemas.openxmlformats.org/markup-compatibility/2006" xmlns:aink="http://schemas.microsoft.com/office/drawing/2016/ink" xmlns:am3d="http://schemas.microsoft.com/office/drawing/2017/model3d" xmlns:o="urn:schemas-microsoft-com:office:office" xmlns:r="http://schemas.openxmlformats.org/officeDocument/2006/relationships" xmlns:m="http://schemas.openxmlformats.org/officeDocument/2006/math" xmlns:v="urn:schemas-microsoft-com:vml" xmlns:wp14="http://schemas.microsoft.com/office/word/2010/wordprocessingDrawing" xmlns:wp="http://schemas.openxmlformats.org/drawingml/2006/wordprocessingDrawing" xmlns:w10="urn:schemas-microsoft-com:office:word" xmlns:w="http://schemas.openxmlformats.org/wordprocessingml/2006/main" xmlns:w14="http://schemas.microsoft.com/office/word/2010/wordml" xmlns:w15="http://schemas.microsoft.com/office/word/2012/wordml" xmlns:w16cex="http://schemas.microsoft.com/office/word/2018/wordml/cex" xmlns:w16cid="http://schemas.microsoft.com/office/word/2016/wordml/cid" xmlns:w16="http://schemas.microsoft.com/office/word/2018/wordml" xmlns:w16sdtdh="http://schemas.microsoft.com/office/word/2020/wordml/sdtdatahash" xmlns:w16se="http://schemas.microsoft.com/office/word/2015/wordml/symex" xmlns:wpg="http://schemas.microsoft.com/office/word/2010/wordprocessingGroup" xmlns:wpi="http://schemas.microsoft.com/office/word/2010/wordprocessingInk" xmlns:wne="http://schemas.microsoft.com/office/word/2006/wordml" xmlns:wps="http://schemas.microsoft.com/office/word/2010/wordprocessingShape" mc:Ignorable="w14 w15 w16se w16cid w16 w16cex w16sdtdh wp14">
+  <w:abstractNum w:abstractNumId="0" w15:restartNumberingAfterBreak="0">
+    <w:nsid w:val="3DC5544F"/>
+    <w:multiLevelType w:val="hybridMultilevel"/>
+    <w:tmpl w:val="B756F7D2"/>
+    <w:lvl w:ilvl="0" w:tplc="CE7E4D02">
       <w:start w:val="1"/>
       <w:numFmt w:val="bullet"/>
       <w:lvlText w:val=""/>
@@ -1059,10 +1016,10 @@
         <w:ind w:left="720" w:hanging="360"/>
       </w:pPr>
       <w:rPr>
-        <w:rFonts w:hint="default" w:ascii="Symbol" w:hAnsi="Symbol"/>
+        <w:rFonts w:ascii="Symbol" w:hAnsi="Symbol" w:hint="default"/>
       </w:rPr>
     </w:lvl>
-    <w:lvl xmlns:w="http://schemas.openxmlformats.org/wordprocessingml/2006/main" w:ilvl="1">
+    <w:lvl w:ilvl="1" w:tplc="C8002750">
       <w:start w:val="1"/>
       <w:numFmt w:val="bullet"/>
       <w:lvlText w:val="o"/>
@@ -1071,10 +1028,10 @@
         <w:ind w:left="1440" w:hanging="360"/>
       </w:pPr>
       <w:rPr>
-        <w:rFonts w:hint="default" w:ascii="Courier New" w:hAnsi="Courier New"/>
+        <w:rFonts w:ascii="Courier New" w:hAnsi="Courier New" w:hint="default"/>
       </w:rPr>
     </w:lvl>
-    <w:lvl xmlns:w="http://schemas.openxmlformats.org/wordprocessingml/2006/main" w:ilvl="2">
+    <w:lvl w:ilvl="2" w:tplc="8EFE4C8E">
       <w:start w:val="1"/>
       <w:numFmt w:val="bullet"/>
       <w:lvlText w:val=""/>
@@ -1083,10 +1040,10 @@
         <w:ind w:left="2160" w:hanging="360"/>
       </w:pPr>
       <w:rPr>
-        <w:rFonts w:hint="default" w:ascii="Wingdings" w:hAnsi="Wingdings"/>
+        <w:rFonts w:ascii="Wingdings" w:hAnsi="Wingdings" w:hint="default"/>
       </w:rPr>
     </w:lvl>
-    <w:lvl xmlns:w="http://schemas.openxmlformats.org/wordprocessingml/2006/main" w:ilvl="3">
+    <w:lvl w:ilvl="3" w:tplc="3F8C6F96">
       <w:start w:val="1"/>
       <w:numFmt w:val="bullet"/>
       <w:lvlText w:val=""/>
@@ -1095,10 +1052,10 @@
         <w:ind w:left="2880" w:hanging="360"/>
       </w:pPr>
       <w:rPr>
-        <w:rFonts w:hint="default" w:ascii="Symbol" w:hAnsi="Symbol"/>
+        <w:rFonts w:ascii="Symbol" w:hAnsi="Symbol" w:hint="default"/>
       </w:rPr>
     </w:lvl>
-    <w:lvl xmlns:w="http://schemas.openxmlformats.org/wordprocessingml/2006/main" w:ilvl="4">
+    <w:lvl w:ilvl="4" w:tplc="50903346">
       <w:start w:val="1"/>
       <w:numFmt w:val="bullet"/>
       <w:lvlText w:val="o"/>
@@ -1107,10 +1064,10 @@
         <w:ind w:left="3600" w:hanging="360"/>
       </w:pPr>
       <w:rPr>
-        <w:rFonts w:hint="default" w:ascii="Courier New" w:hAnsi="Courier New"/>
+        <w:rFonts w:ascii="Courier New" w:hAnsi="Courier New" w:hint="default"/>
       </w:rPr>
     </w:lvl>
-    <w:lvl xmlns:w="http://schemas.openxmlformats.org/wordprocessingml/2006/main" w:ilvl="5">
+    <w:lvl w:ilvl="5" w:tplc="5F96719E">
       <w:start w:val="1"/>
       <w:numFmt w:val="bullet"/>
       <w:lvlText w:val=""/>
@@ -1119,10 +1076,10 @@
         <w:ind w:left="4320" w:hanging="360"/>
       </w:pPr>
       <w:rPr>
-        <w:rFonts w:hint="default" w:ascii="Wingdings" w:hAnsi="Wingdings"/>
+        <w:rFonts w:ascii="Wingdings" w:hAnsi="Wingdings" w:hint="default"/>
       </w:rPr>
     </w:lvl>
-    <w:lvl xmlns:w="http://schemas.openxmlformats.org/wordprocessingml/2006/main" w:ilvl="6">
+    <w:lvl w:ilvl="6" w:tplc="39222DCE">
       <w:start w:val="1"/>
       <w:numFmt w:val="bullet"/>
       <w:lvlText w:val=""/>
@@ -1131,10 +1088,10 @@
         <w:ind w:left="5040" w:hanging="360"/>
       </w:pPr>
       <w:rPr>
-        <w:rFonts w:hint="default" w:ascii="Symbol" w:hAnsi="Symbol"/>
+        <w:rFonts w:ascii="Symbol" w:hAnsi="Symbol" w:hint="default"/>
       </w:rPr>
     </w:lvl>
-    <w:lvl xmlns:w="http://schemas.openxmlformats.org/wordprocessingml/2006/main" w:ilvl="7">
+    <w:lvl w:ilvl="7" w:tplc="B75261CC">
       <w:start w:val="1"/>
       <w:numFmt w:val="bullet"/>
       <w:lvlText w:val="o"/>
@@ -1143,10 +1100,10 @@
         <w:ind w:left="5760" w:hanging="360"/>
       </w:pPr>
       <w:rPr>
-        <w:rFonts w:hint="default" w:ascii="Courier New" w:hAnsi="Courier New"/>
+        <w:rFonts w:ascii="Courier New" w:hAnsi="Courier New" w:hint="default"/>
       </w:rPr>
     </w:lvl>
-    <w:lvl xmlns:w="http://schemas.openxmlformats.org/wordprocessingml/2006/main" w:ilvl="8">
+    <w:lvl w:ilvl="8" w:tplc="36FE0592">
       <w:start w:val="1"/>
       <w:numFmt w:val="bullet"/>
       <w:lvlText w:val=""/>
@@ -1155,22 +1112,22 @@
         <w:ind w:left="6480" w:hanging="360"/>
       </w:pPr>
       <w:rPr>
-        <w:rFonts w:hint="default" w:ascii="Wingdings" w:hAnsi="Wingdings"/>
+        <w:rFonts w:ascii="Wingdings" w:hAnsi="Wingdings" w:hint="default"/>
       </w:rPr>
     </w:lvl>
   </w:abstractNum>
   <w:num w:numId="1">
-    <w:abstractNumId w:val="1"/>
+    <w:abstractNumId w:val="0"/>
   </w:num>
 </w:numbering>
 </file>
 
 <file path=word/styles.xml><?xml version="1.0" encoding="utf-8"?>
-<w:styles xmlns:wp14="http://schemas.microsoft.com/office/word/2010/wordprocessingDrawing" xmlns:mc="http://schemas.openxmlformats.org/markup-compatibility/2006" xmlns:r="http://schemas.openxmlformats.org/officeDocument/2006/relationships" xmlns:w="http://schemas.openxmlformats.org/wordprocessingml/2006/main" xmlns:w14="http://schemas.microsoft.com/office/word/2010/wordml" xmlns:w15="http://schemas.microsoft.com/office/word/2012/wordml" xmlns:w16se="http://schemas.microsoft.com/office/word/2015/wordml/symex" xmlns:w16cid="http://schemas.microsoft.com/office/word/2016/wordml/cid" xmlns:w16="http://schemas.microsoft.com/office/word/2018/wordml" xmlns:w16cex="http://schemas.microsoft.com/office/word/2018/wordml/cex" xmlns:w16sdtdh="http://schemas.microsoft.com/office/word/2020/wordml/sdtdatahash" xmlns:w16sdtfl="http://schemas.microsoft.com/office/word/2024/wordml/sdtformatlock" mc:Ignorable="w14 w15 wp14 w16se w16cid w16 w16cex w16sdtdh w16sdtfl">
+<w:styles xmlns:mc="http://schemas.openxmlformats.org/markup-compatibility/2006" xmlns:r="http://schemas.openxmlformats.org/officeDocument/2006/relationships" xmlns:w="http://schemas.openxmlformats.org/wordprocessingml/2006/main" xmlns:w14="http://schemas.microsoft.com/office/word/2010/wordml" xmlns:w15="http://schemas.microsoft.com/office/word/2012/wordml" xmlns:w16cex="http://schemas.microsoft.com/office/word/2018/wordml/cex" xmlns:w16cid="http://schemas.microsoft.com/office/word/2016/wordml/cid" xmlns:w16="http://schemas.microsoft.com/office/word/2018/wordml" xmlns:w16sdtdh="http://schemas.microsoft.com/office/word/2020/wordml/sdtdatahash" xmlns:w16se="http://schemas.microsoft.com/office/word/2015/wordml/symex" mc:Ignorable="w14 w15 w16se w16cid w16 w16cex w16sdtdh">
   <w:docDefaults>
     <w:rPrDefault>
       <w:rPr>
-        <w:rFonts w:asciiTheme="minorHAnsi" w:hAnsiTheme="minorHAnsi" w:eastAsiaTheme="minorHAnsi" w:cstheme="minorBidi"/>
+        <w:rFonts w:asciiTheme="minorHAnsi" w:eastAsiaTheme="minorHAnsi" w:hAnsiTheme="minorHAnsi" w:cstheme="minorBidi"/>
         <w:sz w:val="24"/>
         <w:szCs w:val="24"/>
         <w:lang w:val="hu-HU" w:eastAsia="en-US" w:bidi="ar-SA"/>
@@ -1182,17 +1139,17 @@
       </w:pPr>
     </w:pPrDefault>
   </w:docDefaults>
-  <w:latentStyles w:defLockedState="0" w:defUIPriority="99" w:defSemiHidden="0" w:defUnhideWhenUsed="0" w:defQFormat="0" w:count="371">
+  <w:latentStyles w:defLockedState="0" w:defUIPriority="99" w:defSemiHidden="0" w:defUnhideWhenUsed="0" w:defQFormat="0" w:count="376">
     <w:lsdException w:name="Normal" w:uiPriority="0" w:qFormat="1"/>
     <w:lsdException w:name="heading 1" w:uiPriority="9" w:qFormat="1"/>
-    <w:lsdException w:name="heading 2" w:uiPriority="9" w:semiHidden="1" w:unhideWhenUsed="1" w:qFormat="1"/>
-    <w:lsdException w:name="heading 3" w:uiPriority="9" w:semiHidden="1" w:unhideWhenUsed="1" w:qFormat="1"/>
-    <w:lsdException w:name="heading 4" w:uiPriority="9" w:semiHidden="1" w:unhideWhenUsed="1" w:qFormat="1"/>
-    <w:lsdException w:name="heading 5" w:uiPriority="9" w:semiHidden="1" w:unhideWhenUsed="1" w:qFormat="1"/>
-    <w:lsdException w:name="heading 6" w:uiPriority="9" w:semiHidden="1" w:unhideWhenUsed="1" w:qFormat="1"/>
-    <w:lsdException w:name="heading 7" w:uiPriority="9" w:semiHidden="1" w:unhideWhenUsed="1" w:qFormat="1"/>
-    <w:lsdException w:name="heading 8" w:uiPriority="9" w:semiHidden="1" w:unhideWhenUsed="1" w:qFormat="1"/>
-    <w:lsdException w:name="heading 9" w:uiPriority="9" w:semiHidden="1" w:unhideWhenUsed="1" w:qFormat="1"/>
+    <w:lsdException w:name="heading 2" w:semiHidden="1" w:uiPriority="9" w:unhideWhenUsed="1" w:qFormat="1"/>
+    <w:lsdException w:name="heading 3" w:semiHidden="1" w:uiPriority="9" w:unhideWhenUsed="1" w:qFormat="1"/>
+    <w:lsdException w:name="heading 4" w:semiHidden="1" w:uiPriority="9" w:unhideWhenUsed="1" w:qFormat="1"/>
+    <w:lsdException w:name="heading 5" w:semiHidden="1" w:uiPriority="9" w:unhideWhenUsed="1" w:qFormat="1"/>
+    <w:lsdException w:name="heading 6" w:semiHidden="1" w:uiPriority="9" w:unhideWhenUsed="1" w:qFormat="1"/>
+    <w:lsdException w:name="heading 7" w:semiHidden="1" w:uiPriority="9" w:unhideWhenUsed="1" w:qFormat="1"/>
+    <w:lsdException w:name="heading 8" w:semiHidden="1" w:uiPriority="9" w:unhideWhenUsed="1" w:qFormat="1"/>
+    <w:lsdException w:name="heading 9" w:semiHidden="1" w:uiPriority="9" w:unhideWhenUsed="1" w:qFormat="1"/>
     <w:lsdException w:name="index 1" w:semiHidden="1" w:unhideWhenUsed="1"/>
     <w:lsdException w:name="index 2" w:semiHidden="1" w:unhideWhenUsed="1"/>
     <w:lsdException w:name="index 3" w:semiHidden="1" w:unhideWhenUsed="1"/>
@@ -1202,22 +1159,22 @@
     <w:lsdException w:name="index 7" w:semiHidden="1" w:unhideWhenUsed="1"/>
     <w:lsdException w:name="index 8" w:semiHidden="1" w:unhideWhenUsed="1"/>
     <w:lsdException w:name="index 9" w:semiHidden="1" w:unhideWhenUsed="1"/>
-    <w:lsdException w:name="toc 1" w:uiPriority="39" w:semiHidden="1" w:unhideWhenUsed="1"/>
-    <w:lsdException w:name="toc 2" w:uiPriority="39" w:semiHidden="1" w:unhideWhenUsed="1"/>
-    <w:lsdException w:name="toc 3" w:uiPriority="39" w:semiHidden="1" w:unhideWhenUsed="1"/>
-    <w:lsdException w:name="toc 4" w:uiPriority="39" w:semiHidden="1" w:unhideWhenUsed="1"/>
-    <w:lsdException w:name="toc 5" w:uiPriority="39" w:semiHidden="1" w:unhideWhenUsed="1"/>
-    <w:lsdException w:name="toc 6" w:uiPriority="39" w:semiHidden="1" w:unhideWhenUsed="1"/>
-    <w:lsdException w:name="toc 7" w:uiPriority="39" w:semiHidden="1" w:unhideWhenUsed="1"/>
-    <w:lsdException w:name="toc 8" w:uiPriority="39" w:semiHidden="1" w:unhideWhenUsed="1"/>
-    <w:lsdException w:name="toc 9" w:uiPriority="39" w:semiHidden="1" w:unhideWhenUsed="1"/>
+    <w:lsdException w:name="toc 1" w:semiHidden="1" w:uiPriority="39" w:unhideWhenUsed="1"/>
+    <w:lsdException w:name="toc 2" w:semiHidden="1" w:uiPriority="39" w:unhideWhenUsed="1"/>
+    <w:lsdException w:name="toc 3" w:semiHidden="1" w:uiPriority="39" w:unhideWhenUsed="1"/>
+    <w:lsdException w:name="toc 4" w:semiHidden="1" w:uiPriority="39" w:unhideWhenUsed="1"/>
+    <w:lsdException w:name="toc 5" w:semiHidden="1" w:uiPriority="39" w:unhideWhenUsed="1"/>
+    <w:lsdException w:name="toc 6" w:semiHidden="1" w:uiPriority="39" w:unhideWhenUsed="1"/>
+    <w:lsdException w:name="toc 7" w:semiHidden="1" w:uiPriority="39" w:unhideWhenUsed="1"/>
+    <w:lsdException w:name="toc 8" w:semiHidden="1" w:uiPriority="39" w:unhideWhenUsed="1"/>
+    <w:lsdException w:name="toc 9" w:semiHidden="1" w:uiPriority="39" w:unhideWhenUsed="1"/>
     <w:lsdException w:name="Normal Indent" w:semiHidden="1" w:unhideWhenUsed="1"/>
     <w:lsdException w:name="footnote text" w:semiHidden="1" w:unhideWhenUsed="1"/>
     <w:lsdException w:name="annotation text" w:semiHidden="1" w:unhideWhenUsed="1"/>
     <w:lsdException w:name="header" w:semiHidden="1" w:unhideWhenUsed="1"/>
     <w:lsdException w:name="footer" w:semiHidden="1" w:unhideWhenUsed="1"/>
     <w:lsdException w:name="index heading" w:semiHidden="1" w:unhideWhenUsed="1"/>
-    <w:lsdException w:name="caption" w:uiPriority="35" w:semiHidden="1" w:unhideWhenUsed="1" w:qFormat="1"/>
+    <w:lsdException w:name="caption" w:semiHidden="1" w:uiPriority="35" w:unhideWhenUsed="1" w:qFormat="1"/>
     <w:lsdException w:name="table of figures" w:semiHidden="1" w:unhideWhenUsed="1"/>
     <w:lsdException w:name="envelope address" w:semiHidden="1" w:unhideWhenUsed="1"/>
     <w:lsdException w:name="envelope return" w:semiHidden="1" w:unhideWhenUsed="1"/>
@@ -1248,7 +1205,7 @@
     <w:lsdException w:name="Title" w:uiPriority="10" w:qFormat="1"/>
     <w:lsdException w:name="Closing" w:semiHidden="1" w:unhideWhenUsed="1"/>
     <w:lsdException w:name="Signature" w:semiHidden="1" w:unhideWhenUsed="1"/>
-    <w:lsdException w:name="Default Paragraph Font" w:uiPriority="1" w:semiHidden="1" w:unhideWhenUsed="1"/>
+    <w:lsdException w:name="Default Paragraph Font" w:semiHidden="1" w:uiPriority="1" w:unhideWhenUsed="1"/>
     <w:lsdException w:name="Body Text" w:semiHidden="1" w:unhideWhenUsed="1"/>
     <w:lsdException w:name="Body Text Indent" w:semiHidden="1" w:unhideWhenUsed="1"/>
     <w:lsdException w:name="List Continue" w:semiHidden="1" w:unhideWhenUsed="1"/>
@@ -1288,7 +1245,6 @@
     <w:lsdException w:name="HTML Sample" w:semiHidden="1" w:unhideWhenUsed="1"/>
     <w:lsdException w:name="HTML Typewriter" w:semiHidden="1" w:unhideWhenUsed="1"/>
     <w:lsdException w:name="HTML Variable" w:semiHidden="1" w:unhideWhenUsed="1"/>
-    <w:lsdException w:name="Normal Table" w:semiHidden="1" w:unhideWhenUsed="1"/>
     <w:lsdException w:name="annotation subject" w:semiHidden="1" w:unhideWhenUsed="1"/>
     <w:lsdException w:name="No List" w:semiHidden="1" w:unhideWhenUsed="1"/>
     <w:lsdException w:name="Outline List 1" w:semiHidden="1" w:unhideWhenUsed="1"/>
@@ -1331,11 +1287,8 @@
     <w:lsdException w:name="Table Contemporary" w:semiHidden="1" w:unhideWhenUsed="1"/>
     <w:lsdException w:name="Table Elegant" w:semiHidden="1" w:unhideWhenUsed="1"/>
     <w:lsdException w:name="Table Professional" w:semiHidden="1" w:unhideWhenUsed="1"/>
-    <w:lsdException w:name="Table Subtle 1" w:semiHidden="1" w:unhideWhenUsed="1"/>
     <w:lsdException w:name="Table Subtle 2" w:semiHidden="1" w:unhideWhenUsed="1"/>
     <w:lsdException w:name="Table Web 1" w:semiHidden="1" w:unhideWhenUsed="1"/>
-    <w:lsdException w:name="Table Web 2" w:semiHidden="1" w:unhideWhenUsed="1"/>
-    <w:lsdException w:name="Table Web 3" w:semiHidden="1" w:unhideWhenUsed="1"/>
     <w:lsdException w:name="Balloon Text" w:semiHidden="1" w:unhideWhenUsed="1"/>
     <w:lsdException w:name="Table Grid" w:uiPriority="39"/>
     <w:lsdException w:name="Table Theme" w:semiHidden="1" w:unhideWhenUsed="1"/>
@@ -1448,8 +1401,8 @@
     <w:lsdException w:name="Subtle Reference" w:uiPriority="31" w:qFormat="1"/>
     <w:lsdException w:name="Intense Reference" w:uiPriority="32" w:qFormat="1"/>
     <w:lsdException w:name="Book Title" w:uiPriority="33" w:qFormat="1"/>
-    <w:lsdException w:name="Bibliography" w:uiPriority="37" w:semiHidden="1" w:unhideWhenUsed="1"/>
-    <w:lsdException w:name="TOC Heading" w:uiPriority="39" w:semiHidden="1" w:unhideWhenUsed="1" w:qFormat="1"/>
+    <w:lsdException w:name="Bibliography" w:semiHidden="1" w:uiPriority="37" w:unhideWhenUsed="1"/>
+    <w:lsdException w:name="TOC Heading" w:semiHidden="1" w:uiPriority="39" w:unhideWhenUsed="1" w:qFormat="1"/>
     <w:lsdException w:name="Plain Table 1" w:uiPriority="41"/>
     <w:lsdException w:name="Plain Table 2" w:uiPriority="42"/>
     <w:lsdException w:name="Plain Table 3" w:uiPriority="43"/>
@@ -1554,18 +1507,23 @@
     <w:lsdException w:name="List Table 5 Dark Accent 6" w:uiPriority="50"/>
     <w:lsdException w:name="List Table 6 Colorful Accent 6" w:uiPriority="51"/>
     <w:lsdException w:name="List Table 7 Colorful Accent 6" w:uiPriority="52"/>
+    <w:lsdException w:name="Mention" w:semiHidden="1" w:unhideWhenUsed="1"/>
+    <w:lsdException w:name="Smart Hyperlink" w:semiHidden="1" w:unhideWhenUsed="1"/>
+    <w:lsdException w:name="Hashtag" w:semiHidden="1" w:unhideWhenUsed="1"/>
+    <w:lsdException w:name="Unresolved Mention" w:semiHidden="1" w:unhideWhenUsed="1"/>
+    <w:lsdException w:name="Smart Link" w:semiHidden="1" w:unhideWhenUsed="1"/>
   </w:latentStyles>
-  <w:style w:type="paragraph" w:styleId="Normal" w:default="1">
+  <w:style w:type="paragraph" w:default="1" w:styleId="Norml">
     <w:name w:val="Normal"/>
     <w:qFormat/>
   </w:style>
-  <w:style w:type="character" w:styleId="DefaultParagraphFont" w:default="1">
+  <w:style w:type="character" w:default="1" w:styleId="Bekezdsalapbettpusa">
     <w:name w:val="Default Paragraph Font"/>
     <w:uiPriority w:val="1"/>
     <w:semiHidden/>
     <w:unhideWhenUsed/>
   </w:style>
-  <w:style w:type="table" w:styleId="TableNormal" w:default="1">
+  <w:style w:type="table" w:default="1" w:styleId="Normltblzat">
     <w:name w:val="Normal Table"/>
     <w:uiPriority w:val="99"/>
     <w:semiHidden/>
@@ -1580,115 +1538,114 @@
       </w:tblCellMar>
     </w:tblPr>
   </w:style>
-  <w:style w:type="numbering" w:styleId="NoList" w:default="1">
+  <w:style w:type="numbering" w:default="1" w:styleId="Nemlista">
     <w:name w:val="No List"/>
     <w:uiPriority w:val="99"/>
     <w:semiHidden/>
     <w:unhideWhenUsed/>
   </w:style>
-  <w:style w:type="paragraph" w:styleId="Subtitle">
+  <w:style w:type="paragraph" w:styleId="Alcm">
+    <w:name w:val="Subtitle"/>
+    <w:basedOn w:val="Norml"/>
+    <w:next w:val="Norml"/>
+    <w:link w:val="AlcmChar"/>
     <w:uiPriority w:val="11"/>
-    <w:name w:val="Subtitle"/>
-    <w:basedOn w:val="Normal"/>
-    <w:next w:val="Normal"/>
-    <w:link w:val="SubtitleChar"/>
     <w:qFormat/>
     <w:rsid w:val="286A79D5"/>
+    <w:pPr>
+      <w:spacing w:before="120" w:after="120" w:line="240" w:lineRule="auto"/>
+      <w:jc w:val="both"/>
+    </w:pPr>
     <w:rPr>
-      <w:rFonts w:ascii="EB Garamond" w:hAnsi="EB Garamond" w:eastAsia="EB Garamond" w:cs="EB Garamond"/>
-      <w:color w:val="auto"/>
+      <w:rFonts w:ascii="EB Garamond" w:eastAsia="EB Garamond" w:hAnsi="EB Garamond" w:cs="EB Garamond"/>
       <w:sz w:val="26"/>
       <w:szCs w:val="26"/>
     </w:rPr>
-    <w:pPr>
-      <w:spacing w:before="120" w:beforeAutospacing="off" w:after="120" w:afterAutospacing="off" w:line="240" w:lineRule="auto"/>
-      <w:jc w:val="both"/>
-    </w:pPr>
   </w:style>
-  <w:style w:type="character" w:styleId="SubtitleChar" w:customStyle="true">
+  <w:style w:type="character" w:customStyle="1" w:styleId="AlcmChar">
+    <w:name w:val="Alcím Char"/>
+    <w:basedOn w:val="Bekezdsalapbettpusa"/>
+    <w:link w:val="Alcm"/>
     <w:uiPriority w:val="11"/>
-    <w:name w:val="Subtitle Char"/>
-    <w:basedOn w:val="DefaultParagraphFont"/>
-    <w:link w:val="Subtitle"/>
     <w:rsid w:val="286A79D5"/>
     <w:rPr>
-      <w:rFonts w:ascii="EB Garamond" w:hAnsi="EB Garamond" w:eastAsia="EB Garamond" w:cs="EB Garamond"/>
+      <w:rFonts w:ascii="EB Garamond" w:eastAsia="EB Garamond" w:hAnsi="EB Garamond" w:cs="EB Garamond"/>
       <w:color w:val="auto"/>
       <w:sz w:val="26"/>
       <w:szCs w:val="26"/>
     </w:rPr>
   </w:style>
-  <w:style w:type="paragraph" w:styleId="ListParagraph">
+  <w:style w:type="paragraph" w:styleId="Listaszerbekezds">
+    <w:name w:val="List Paragraph"/>
+    <w:basedOn w:val="Norml"/>
     <w:uiPriority w:val="34"/>
-    <w:name w:val="List Paragraph"/>
-    <w:basedOn w:val="Normal"/>
     <w:qFormat/>
     <w:rsid w:val="754E8E0C"/>
     <w:pPr>
-      <w:spacing/>
       <w:ind w:left="720"/>
       <w:contextualSpacing/>
     </w:pPr>
   </w:style>
-  <w:style w:type="paragraph" w:styleId="Header">
+  <w:style w:type="paragraph" w:styleId="lfej">
+    <w:name w:val="header"/>
+    <w:basedOn w:val="Norml"/>
     <w:uiPriority w:val="99"/>
-    <w:name w:val="header"/>
-    <w:basedOn w:val="Normal"/>
     <w:unhideWhenUsed/>
     <w:rsid w:val="754E8E0C"/>
     <w:pPr>
       <w:tabs>
-        <w:tab w:val="center" w:leader="none" w:pos="4680"/>
-        <w:tab w:val="right" w:leader="none" w:pos="9360"/>
+        <w:tab w:val="center" w:pos="4680"/>
+        <w:tab w:val="right" w:pos="9360"/>
       </w:tabs>
       <w:spacing w:after="0" w:line="240" w:lineRule="auto"/>
     </w:pPr>
   </w:style>
-  <w:style w:type="paragraph" w:styleId="Footer">
+  <w:style w:type="paragraph" w:styleId="llb">
+    <w:name w:val="footer"/>
+    <w:basedOn w:val="Norml"/>
+    <w:link w:val="llbChar"/>
     <w:uiPriority w:val="99"/>
-    <w:name w:val="footer"/>
-    <w:basedOn w:val="Normal"/>
     <w:unhideWhenUsed/>
     <w:rsid w:val="754E8E0C"/>
     <w:pPr>
       <w:tabs>
-        <w:tab w:val="center" w:leader="none" w:pos="4680"/>
-        <w:tab w:val="right" w:leader="none" w:pos="9360"/>
+        <w:tab w:val="center" w:pos="4680"/>
+        <w:tab w:val="right" w:pos="9360"/>
       </w:tabs>
       <w:spacing w:after="0" w:line="240" w:lineRule="auto"/>
     </w:pPr>
   </w:style>
-  <w:style xmlns:w="http://schemas.openxmlformats.org/wordprocessingml/2006/main" w:type="table" w:styleId="TableGrid">
-    <w:name xmlns:w="http://schemas.openxmlformats.org/wordprocessingml/2006/main" w:val="Table Grid"/>
-    <w:basedOn xmlns:w="http://schemas.openxmlformats.org/wordprocessingml/2006/main" w:val="TableNormal"/>
-    <w:uiPriority xmlns:w="http://schemas.openxmlformats.org/wordprocessingml/2006/main" w:val="59"/>
-    <w:rsid xmlns:w="http://schemas.openxmlformats.org/wordprocessingml/2006/main" w:val="00FB4123"/>
-    <w:pPr xmlns:w="http://schemas.openxmlformats.org/wordprocessingml/2006/main">
+  <w:style w:type="table" w:styleId="Rcsostblzat">
+    <w:name w:val="Table Grid"/>
+    <w:basedOn w:val="Normltblzat"/>
+    <w:uiPriority w:val="59"/>
+    <w:rsid w:val="00FB4123"/>
+    <w:pPr>
       <w:spacing w:after="0" w:line="240" w:lineRule="auto"/>
     </w:pPr>
-    <w:tblPr xmlns:w="http://schemas.openxmlformats.org/wordprocessingml/2006/main">
-      <w:tblInd w:w="0" w:type="dxa"/>
+    <w:tblPr>
       <w:tblBorders>
-        <w:top w:val="single" w:color="000000" w:themeColor="text1" w:sz="4" w:space="0"/>
-        <w:left w:val="single" w:color="000000" w:themeColor="text1" w:sz="4" w:space="0"/>
-        <w:bottom w:val="single" w:color="000000" w:themeColor="text1" w:sz="4" w:space="0"/>
-        <w:right w:val="single" w:color="000000" w:themeColor="text1" w:sz="4" w:space="0"/>
-        <w:insideH w:val="single" w:color="000000" w:themeColor="text1" w:sz="4" w:space="0"/>
-        <w:insideV w:val="single" w:color="000000" w:themeColor="text1" w:sz="4" w:space="0"/>
+        <w:top w:val="single" w:sz="4" w:space="0" w:color="000000" w:themeColor="text1"/>
+        <w:left w:val="single" w:sz="4" w:space="0" w:color="000000" w:themeColor="text1"/>
+        <w:bottom w:val="single" w:sz="4" w:space="0" w:color="000000" w:themeColor="text1"/>
+        <w:right w:val="single" w:sz="4" w:space="0" w:color="000000" w:themeColor="text1"/>
+        <w:insideH w:val="single" w:sz="4" w:space="0" w:color="000000" w:themeColor="text1"/>
+        <w:insideV w:val="single" w:sz="4" w:space="0" w:color="000000" w:themeColor="text1"/>
       </w:tblBorders>
-      <w:tblCellMar>
-        <w:top w:w="0" w:type="dxa"/>
-        <w:left w:w="108" w:type="dxa"/>
-        <w:bottom w:w="0" w:type="dxa"/>
-        <w:right w:w="108" w:type="dxa"/>
-      </w:tblCellMar>
     </w:tblPr>
+  </w:style>
+  <w:style w:type="character" w:customStyle="1" w:styleId="llbChar">
+    <w:name w:val="Élőláb Char"/>
+    <w:basedOn w:val="Bekezdsalapbettpusa"/>
+    <w:link w:val="llb"/>
+    <w:uiPriority w:val="99"/>
+    <w:rsid w:val="00C205AC"/>
   </w:style>
 </w:styles>
 </file>
 
 <file path=word/theme/theme1.xml><?xml version="1.0" encoding="utf-8"?>
-<a:theme xmlns:thm15="http://schemas.microsoft.com/office/thememl/2012/main" xmlns:a="http://schemas.openxmlformats.org/drawingml/2006/main" name="Office Theme">
+<a:theme xmlns:a="http://schemas.openxmlformats.org/drawingml/2006/main" name="Office Theme">
   <a:themeElements>
     <a:clrScheme name="Office">
       <a:dk1>
@@ -1946,4 +1903,16 @@
     </a:ext>
   </a:extLst>
 </a:theme>
+</file>
+
+<file path=customXml/item1.xml><?xml version="1.0" encoding="utf-8"?>
+<b:Sources xmlns:b="http://schemas.openxmlformats.org/officeDocument/2006/bibliography" xmlns="http://schemas.openxmlformats.org/officeDocument/2006/bibliography" SelectedStyle="\APASixthEditionOfficeOnline.xsl" StyleName="APA" Version="6"/>
+</file>
+
+<file path=customXml/itemProps1.xml><?xml version="1.0" encoding="utf-8"?>
+<ds:datastoreItem xmlns:ds="http://schemas.openxmlformats.org/officeDocument/2006/customXml" ds:itemID="{A241A56E-F594-4506-8F9F-EAD28F9DFC73}">
+  <ds:schemaRefs>
+    <ds:schemaRef ds:uri="http://schemas.openxmlformats.org/officeDocument/2006/bibliography"/>
+  </ds:schemaRefs>
+</ds:datastoreItem>
 </file>
</xml_diff>